<commit_message>
Refresh Stashflow UI, refine payment validation, and update project reports
</commit_message>
<xml_diff>
--- a/Stashflow_AKTU_Project_Report_Completed.docx
+++ b/Stashflow_AKTU_Project_Report_Completed.docx
@@ -623,9 +623,9 @@
           <w:b/>
           <w:i w:val="0"/>
           <w:color w:val="000000"/>
-          <w:sz w:val="32"/>
+          <w:sz w:val="28"/>
         </w:rPr>
-        <w:t>BONAFIDE CERTIFICATE</w:t>
+        <w:t>CERTIFICATE OF APPROVAL</w:t>
       </w:r>
     </w:p>
     <w:p>
@@ -637,7 +637,7 @@
           <w:color w:val="000000"/>
           <w:sz w:val="24"/>
         </w:rPr>
-        <w:t>This is to certify that the project report entitled “Stashflow: Web Based Investment and Trading Dashboard” is a bonafide record of the project work carried out by the student or project team named below under my supervision and guidance. The work is submitted to Dr A P J Abdul Kalam Technical University, Uttar Pradesh, Lucknow, in partial fulfilment of the requirements for the award of the degree of Bachelor of Technology in Computer Science and Engineering (Artificial Intelligence and Machine Learning) during the academic session 2026–2027.</w:t>
+        <w:t>This is to certify that Shubham Sonkar (Roll No. 2401661530066), Mradul Singh (Roll No. 2401661530035), Divya Tiwari (Roll No. 2401661530018), and Ashi Shukla (Roll No. 2401661530013) have completed the mini project entitled “Stashflow: Web Based Investment and Trading Dashboard” under the guidance of Sarvesh Sir. The report is submitted in partial fulfilment of the Bachelor of Technology course in Computer Science and Engineering (Artificial Intelligence and Machine Learning) at Dr Ambedkar Institute of Technology for Divyangjan Kanpur during the academic session 2026–2027.</w:t>
       </w:r>
     </w:p>
     <w:p>
@@ -649,7 +649,7 @@
           <w:color w:val="000000"/>
           <w:sz w:val="24"/>
         </w:rPr>
-        <w:t>To the best of my knowledge, the work presented in this report has not been submitted elsewhere for the award of any other degree or diploma. The implementation, observations, limitations, and results stated in the report have been examined for academic submission.</w:t>
+        <w:t>To the best of our knowledge, this work has not been submitted elsewhere for the award of any degree or diploma. The project work and report have been examined for academic submission.</w:t>
       </w:r>
     </w:p>
     <w:p>
@@ -1312,9 +1312,9 @@
           <w:b/>
           <w:i w:val="0"/>
           <w:color w:val="000000"/>
-          <w:sz w:val="32"/>
+          <w:sz w:val="28"/>
         </w:rPr>
-        <w:t>STUDENT DECLARATION</w:t>
+        <w:t>CANDIDATE DECLARATION</w:t>
       </w:r>
     </w:p>
     <w:p>
@@ -1326,7 +1326,7 @@
           <w:color w:val="000000"/>
           <w:sz w:val="24"/>
         </w:rPr>
-        <w:t>We hereby declare that the project report entitled “Stashflow: Web Based Investment and Trading Dashboard” is an original account of the work undertaken by us under the supervision of the project guide named in this report. The source code, design decisions, testing evidence, and technical discussion have been prepared for this academic project. Wherever the ideas, documentation, or software of other authors and organisations have been used, suitable acknowledgement has been provided in the references.</w:t>
+        <w:t>We certify that the mini project report entitled “Stashflow: Web Based Investment and Trading Dashboard” is an authentic record of work carried out by us under the supervision of Sarvesh Sir at Dr Ambedkar Institute of Technology for Divyangjan Kanpur. The source code, design decisions, testing evidence, and technical discussion have been prepared for this academic project. Wherever the ideas, documentation, or software of other authors and organisations have been used, suitable acknowledgement has been provided in the references.</w:t>
       </w:r>
     </w:p>
     <w:p>
@@ -1338,7 +1338,7 @@
           <w:color w:val="000000"/>
           <w:sz w:val="24"/>
         </w:rPr>
-        <w:t>We further declare that this report has not been submitted, either in full or in part, for the award of any degree or diploma at this or any other university. We accept responsibility for the correctness of the reported work and understand that the institution may verify the report for originality and technical accuracy.</w:t>
+        <w:t>The matter presented in this report has not been submitted elsewhere, in full or in part, for the award of any degree or diploma. We accept responsibility for the correctness and originality of the reported work.</w:t>
       </w:r>
     </w:p>
     <w:p>
@@ -1814,6 +1814,162 @@
     </w:p>
     <w:p>
       <w:r>
+        <w:rPr>
+          <w:rFonts w:ascii="Times New Roman" w:hAnsi="Times New Roman"/>
+          <w:b w:val="0"/>
+          <w:i w:val="0"/>
+          <w:color w:val="000000"/>
+          <w:sz w:val="24"/>
+        </w:rPr>
+        <w:t>This is to certify that the above declaration is correct to the best of our knowledge.</w:t>
+      </w:r>
+    </w:p>
+    <w:tbl>
+      <w:tblPr>
+        <w:tblW w:type="auto" w:w="0"/>
+        <w:jc w:val="center"/>
+        <w:tblLayout w:type="fixed"/>
+        <w:tblLook w:firstColumn="1" w:firstRow="1" w:lastColumn="0" w:lastRow="0" w:noHBand="0" w:noVBand="1" w:val="04A0"/>
+        <w:tblBorders>
+          <w:top w:val="single" w:sz="6" w:color="D9D9D9"/>
+          <w:left w:val="single" w:sz="6" w:color="D9D9D9"/>
+          <w:bottom w:val="single" w:sz="6" w:color="D9D9D9"/>
+          <w:right w:val="single" w:sz="6" w:color="D9D9D9"/>
+          <w:insideH w:val="single" w:sz="6" w:color="D9D9D9"/>
+          <w:insideV w:val="single" w:sz="6" w:color="D9D9D9"/>
+        </w:tblBorders>
+      </w:tblPr>
+      <w:tblGrid>
+        <w:gridCol w:w="4262"/>
+        <w:gridCol w:w="4262"/>
+      </w:tblGrid>
+      <w:tr>
+        <w:trPr>
+          <w:tblHeader w:val="true"/>
+        </w:trPr>
+        <w:tc>
+          <w:tcPr>
+            <w:tcW w:type="dxa" w:w="3600"/>
+            <w:shd w:fill="1F4E78"/>
+            <w:tcMar>
+              <w:top w:w="90" w:type="dxa"/>
+              <w:start w:w="110" w:type="dxa"/>
+              <w:bottom w:w="90" w:type="dxa"/>
+              <w:end w:w="110" w:type="dxa"/>
+            </w:tcMar>
+            <w:vAlign w:val="center"/>
+          </w:tcPr>
+          <w:p>
+            <w:pPr>
+              <w:jc w:val="center"/>
+            </w:pPr>
+            <w:r>
+              <w:rPr>
+                <w:rFonts w:ascii="Times New Roman" w:hAnsi="Times New Roman"/>
+                <w:b/>
+                <w:i w:val="0"/>
+                <w:color w:val="FFFFFF"/>
+                <w:sz w:val="20"/>
+              </w:rPr>
+              <w:t>Date</w:t>
+            </w:r>
+          </w:p>
+        </w:tc>
+        <w:tc>
+          <w:tcPr>
+            <w:tcW w:type="dxa" w:w="5616"/>
+            <w:shd w:fill="1F4E78"/>
+            <w:tcMar>
+              <w:top w:w="90" w:type="dxa"/>
+              <w:start w:w="110" w:type="dxa"/>
+              <w:bottom w:w="90" w:type="dxa"/>
+              <w:end w:w="110" w:type="dxa"/>
+            </w:tcMar>
+            <w:vAlign w:val="center"/>
+          </w:tcPr>
+          <w:p>
+            <w:pPr>
+              <w:jc w:val="center"/>
+            </w:pPr>
+            <w:r>
+              <w:rPr>
+                <w:rFonts w:ascii="Times New Roman" w:hAnsi="Times New Roman"/>
+                <w:b/>
+                <w:i w:val="0"/>
+                <w:color w:val="FFFFFF"/>
+                <w:sz w:val="20"/>
+              </w:rPr>
+              <w:t>Project Guide Signature</w:t>
+            </w:r>
+          </w:p>
+        </w:tc>
+      </w:tr>
+      <w:tr>
+        <w:tc>
+          <w:tcPr>
+            <w:tcW w:type="dxa" w:w="3600"/>
+            <w:tcMar>
+              <w:top w:w="90" w:type="dxa"/>
+              <w:start w:w="110" w:type="dxa"/>
+              <w:bottom w:w="90" w:type="dxa"/>
+              <w:end w:w="110" w:type="dxa"/>
+            </w:tcMar>
+            <w:vAlign w:val="center"/>
+          </w:tcPr>
+          <w:p>
+            <w:pPr>
+              <w:spacing w:line="240" w:lineRule="auto" w:after="0"/>
+              <w:jc w:val="center"/>
+            </w:pPr>
+            <w:r>
+              <w:rPr>
+                <w:rFonts w:ascii="Times New Roman" w:hAnsi="Times New Roman"/>
+                <w:b w:val="0"/>
+                <w:i w:val="0"/>
+                <w:color w:val="000000"/>
+                <w:sz w:val="19"/>
+              </w:rPr>
+              <w:t>____________________</w:t>
+            </w:r>
+          </w:p>
+        </w:tc>
+        <w:tc>
+          <w:tcPr>
+            <w:tcW w:type="dxa" w:w="5616"/>
+            <w:tcMar>
+              <w:top w:w="90" w:type="dxa"/>
+              <w:start w:w="110" w:type="dxa"/>
+              <w:bottom w:w="90" w:type="dxa"/>
+              <w:end w:w="110" w:type="dxa"/>
+            </w:tcMar>
+            <w:vAlign w:val="center"/>
+          </w:tcPr>
+          <w:p>
+            <w:pPr>
+              <w:spacing w:line="240" w:lineRule="auto" w:after="0"/>
+              <w:jc w:val="left"/>
+            </w:pPr>
+            <w:r>
+              <w:rPr>
+                <w:rFonts w:ascii="Times New Roman" w:hAnsi="Times New Roman"/>
+                <w:b w:val="0"/>
+                <w:i w:val="0"/>
+                <w:color w:val="000000"/>
+                <w:sz w:val="19"/>
+              </w:rPr>
+              <w:t>____________________________</w:t>
+            </w:r>
+          </w:p>
+        </w:tc>
+      </w:tr>
+    </w:tbl>
+    <w:p>
+      <w:pPr>
+        <w:spacing w:after="40"/>
+      </w:pPr>
+    </w:p>
+    <w:p>
+      <w:r>
         <w:br w:type="page"/>
       </w:r>
     </w:p>
@@ -1828,7 +1984,7 @@
           <w:b/>
           <w:i w:val="0"/>
           <w:color w:val="000000"/>
-          <w:sz w:val="32"/>
+          <w:sz w:val="28"/>
         </w:rPr>
         <w:t>ACKNOWLEDGEMENT</w:t>
       </w:r>
@@ -1842,7 +1998,7 @@
           <w:color w:val="000000"/>
           <w:sz w:val="24"/>
         </w:rPr>
-        <w:t>We express our sincere gratitude to our project guide for continuous guidance, technical suggestions, and careful review during the development of Stashflow. The guidance helped us convert an initial idea into a structured web application and encouraged us to evaluate the system not only for visible functionality but also for data validation, security, reliability, and deployment behaviour.</w:t>
+        <w:t>We express our sincere gratitude to Sarvesh Sir, our project guide, for his guidance, technical suggestions, and careful review during the development of Stashflow at Dr Ambedkar Institute of Technology for Divyangjan Kanpur. His support helped us turn the project idea into a structured web application and encouraged us to evaluate the system for functionality, data validation, security, reliability, and deployment behaviour.</w:t>
       </w:r>
     </w:p>
     <w:p>
@@ -2204,6 +2360,1854 @@
     </w:p>
     <w:p>
       <w:pPr>
+        <w:spacing w:after="240"/>
+        <w:jc w:val="center"/>
+      </w:pPr>
+      <w:r>
+        <w:rPr>
+          <w:rFonts w:ascii="Times New Roman" w:hAnsi="Times New Roman"/>
+          <w:b/>
+          <w:i w:val="0"/>
+          <w:color w:val="000000"/>
+          <w:sz w:val="28"/>
+        </w:rPr>
+        <w:t>LIST OF FIGURES</w:t>
+      </w:r>
+    </w:p>
+    <w:tbl>
+      <w:tblPr>
+        <w:tblW w:type="auto" w:w="0"/>
+        <w:jc w:val="center"/>
+        <w:tblLayout w:type="fixed"/>
+        <w:tblLook w:firstColumn="1" w:firstRow="1" w:lastColumn="0" w:lastRow="0" w:noHBand="0" w:noVBand="1" w:val="04A0"/>
+        <w:tblBorders>
+          <w:top w:val="single" w:sz="6" w:color="D9D9D9"/>
+          <w:left w:val="single" w:sz="6" w:color="D9D9D9"/>
+          <w:bottom w:val="single" w:sz="6" w:color="D9D9D9"/>
+          <w:right w:val="single" w:sz="6" w:color="D9D9D9"/>
+          <w:insideH w:val="single" w:sz="6" w:color="D9D9D9"/>
+          <w:insideV w:val="single" w:sz="6" w:color="D9D9D9"/>
+        </w:tblBorders>
+      </w:tblPr>
+      <w:tblGrid>
+        <w:gridCol w:w="4262"/>
+        <w:gridCol w:w="4262"/>
+      </w:tblGrid>
+      <w:tr>
+        <w:trPr>
+          <w:tblHeader w:val="true"/>
+        </w:trPr>
+        <w:tc>
+          <w:tcPr>
+            <w:tcW w:type="dxa" w:w="1584"/>
+            <w:shd w:fill="1F4E78"/>
+            <w:tcMar>
+              <w:top w:w="90" w:type="dxa"/>
+              <w:start w:w="110" w:type="dxa"/>
+              <w:bottom w:w="90" w:type="dxa"/>
+              <w:end w:w="110" w:type="dxa"/>
+            </w:tcMar>
+            <w:vAlign w:val="center"/>
+          </w:tcPr>
+          <w:p>
+            <w:pPr>
+              <w:jc w:val="center"/>
+            </w:pPr>
+            <w:r>
+              <w:rPr>
+                <w:rFonts w:ascii="Times New Roman" w:hAnsi="Times New Roman"/>
+                <w:b/>
+                <w:i w:val="0"/>
+                <w:color w:val="FFFFFF"/>
+                <w:sz w:val="20"/>
+              </w:rPr>
+              <w:t>Figure</w:t>
+            </w:r>
+          </w:p>
+        </w:tc>
+        <w:tc>
+          <w:tcPr>
+            <w:tcW w:type="dxa" w:w="7632"/>
+            <w:shd w:fill="1F4E78"/>
+            <w:tcMar>
+              <w:top w:w="90" w:type="dxa"/>
+              <w:start w:w="110" w:type="dxa"/>
+              <w:bottom w:w="90" w:type="dxa"/>
+              <w:end w:w="110" w:type="dxa"/>
+            </w:tcMar>
+            <w:vAlign w:val="center"/>
+          </w:tcPr>
+          <w:p>
+            <w:pPr>
+              <w:jc w:val="center"/>
+            </w:pPr>
+            <w:r>
+              <w:rPr>
+                <w:rFonts w:ascii="Times New Roman" w:hAnsi="Times New Roman"/>
+                <w:b/>
+                <w:i w:val="0"/>
+                <w:color w:val="FFFFFF"/>
+                <w:sz w:val="20"/>
+              </w:rPr>
+              <w:t>Title</w:t>
+            </w:r>
+          </w:p>
+        </w:tc>
+      </w:tr>
+      <w:tr>
+        <w:tc>
+          <w:tcPr>
+            <w:tcW w:type="dxa" w:w="1584"/>
+            <w:tcMar>
+              <w:top w:w="90" w:type="dxa"/>
+              <w:start w:w="110" w:type="dxa"/>
+              <w:bottom w:w="90" w:type="dxa"/>
+              <w:end w:w="110" w:type="dxa"/>
+            </w:tcMar>
+            <w:vAlign w:val="center"/>
+          </w:tcPr>
+          <w:p>
+            <w:pPr>
+              <w:spacing w:line="240" w:lineRule="auto" w:after="0"/>
+              <w:jc w:val="center"/>
+            </w:pPr>
+            <w:r>
+              <w:rPr>
+                <w:rFonts w:ascii="Times New Roman" w:hAnsi="Times New Roman"/>
+                <w:b w:val="0"/>
+                <w:i w:val="0"/>
+                <w:color w:val="000000"/>
+                <w:sz w:val="19"/>
+              </w:rPr>
+              <w:t>4.1</w:t>
+            </w:r>
+          </w:p>
+        </w:tc>
+        <w:tc>
+          <w:tcPr>
+            <w:tcW w:type="dxa" w:w="7632"/>
+            <w:tcMar>
+              <w:top w:w="90" w:type="dxa"/>
+              <w:start w:w="110" w:type="dxa"/>
+              <w:bottom w:w="90" w:type="dxa"/>
+              <w:end w:w="110" w:type="dxa"/>
+            </w:tcMar>
+            <w:vAlign w:val="center"/>
+          </w:tcPr>
+          <w:p>
+            <w:pPr>
+              <w:spacing w:line="240" w:lineRule="auto" w:after="0"/>
+              <w:jc w:val="left"/>
+            </w:pPr>
+            <w:r>
+              <w:rPr>
+                <w:rFonts w:ascii="Times New Roman" w:hAnsi="Times New Roman"/>
+                <w:b w:val="0"/>
+                <w:i w:val="0"/>
+                <w:color w:val="000000"/>
+                <w:sz w:val="19"/>
+              </w:rPr>
+              <w:t>Logical architecture of Stashflow</w:t>
+            </w:r>
+          </w:p>
+        </w:tc>
+      </w:tr>
+      <w:tr>
+        <w:tc>
+          <w:tcPr>
+            <w:tcW w:type="dxa" w:w="1584"/>
+            <w:tcMar>
+              <w:top w:w="90" w:type="dxa"/>
+              <w:start w:w="110" w:type="dxa"/>
+              <w:bottom w:w="90" w:type="dxa"/>
+              <w:end w:w="110" w:type="dxa"/>
+            </w:tcMar>
+            <w:vAlign w:val="center"/>
+            <w:shd w:fill="F2F6FA"/>
+          </w:tcPr>
+          <w:p>
+            <w:pPr>
+              <w:spacing w:line="240" w:lineRule="auto" w:after="0"/>
+              <w:jc w:val="center"/>
+            </w:pPr>
+            <w:r>
+              <w:rPr>
+                <w:rFonts w:ascii="Times New Roman" w:hAnsi="Times New Roman"/>
+                <w:b w:val="0"/>
+                <w:i w:val="0"/>
+                <w:color w:val="000000"/>
+                <w:sz w:val="19"/>
+              </w:rPr>
+              <w:t>4.2</w:t>
+            </w:r>
+          </w:p>
+        </w:tc>
+        <w:tc>
+          <w:tcPr>
+            <w:tcW w:type="dxa" w:w="7632"/>
+            <w:tcMar>
+              <w:top w:w="90" w:type="dxa"/>
+              <w:start w:w="110" w:type="dxa"/>
+              <w:bottom w:w="90" w:type="dxa"/>
+              <w:end w:w="110" w:type="dxa"/>
+            </w:tcMar>
+            <w:vAlign w:val="center"/>
+            <w:shd w:fill="F2F6FA"/>
+          </w:tcPr>
+          <w:p>
+            <w:pPr>
+              <w:spacing w:line="240" w:lineRule="auto" w:after="0"/>
+              <w:jc w:val="left"/>
+            </w:pPr>
+            <w:r>
+              <w:rPr>
+                <w:rFonts w:ascii="Times New Roman" w:hAnsi="Times New Roman"/>
+                <w:b w:val="0"/>
+                <w:i w:val="0"/>
+                <w:color w:val="000000"/>
+                <w:sz w:val="19"/>
+              </w:rPr>
+              <w:t>Authentication request flow</w:t>
+            </w:r>
+          </w:p>
+        </w:tc>
+      </w:tr>
+      <w:tr>
+        <w:tc>
+          <w:tcPr>
+            <w:tcW w:type="dxa" w:w="1584"/>
+            <w:tcMar>
+              <w:top w:w="90" w:type="dxa"/>
+              <w:start w:w="110" w:type="dxa"/>
+              <w:bottom w:w="90" w:type="dxa"/>
+              <w:end w:w="110" w:type="dxa"/>
+            </w:tcMar>
+            <w:vAlign w:val="center"/>
+          </w:tcPr>
+          <w:p>
+            <w:pPr>
+              <w:spacing w:line="240" w:lineRule="auto" w:after="0"/>
+              <w:jc w:val="center"/>
+            </w:pPr>
+            <w:r>
+              <w:rPr>
+                <w:rFonts w:ascii="Times New Roman" w:hAnsi="Times New Roman"/>
+                <w:b w:val="0"/>
+                <w:i w:val="0"/>
+                <w:color w:val="000000"/>
+                <w:sz w:val="19"/>
+              </w:rPr>
+              <w:t>4.3</w:t>
+            </w:r>
+          </w:p>
+        </w:tc>
+        <w:tc>
+          <w:tcPr>
+            <w:tcW w:type="dxa" w:w="7632"/>
+            <w:tcMar>
+              <w:top w:w="90" w:type="dxa"/>
+              <w:start w:w="110" w:type="dxa"/>
+              <w:bottom w:w="90" w:type="dxa"/>
+              <w:end w:w="110" w:type="dxa"/>
+            </w:tcMar>
+            <w:vAlign w:val="center"/>
+          </w:tcPr>
+          <w:p>
+            <w:pPr>
+              <w:spacing w:line="240" w:lineRule="auto" w:after="0"/>
+              <w:jc w:val="left"/>
+            </w:pPr>
+            <w:r>
+              <w:rPr>
+                <w:rFonts w:ascii="Times New Roman" w:hAnsi="Times New Roman"/>
+                <w:b w:val="0"/>
+                <w:i w:val="0"/>
+                <w:color w:val="000000"/>
+                <w:sz w:val="19"/>
+              </w:rPr>
+              <w:t>Razorpay test payment sequence</w:t>
+            </w:r>
+          </w:p>
+        </w:tc>
+      </w:tr>
+      <w:tr>
+        <w:tc>
+          <w:tcPr>
+            <w:tcW w:type="dxa" w:w="1584"/>
+            <w:tcMar>
+              <w:top w:w="90" w:type="dxa"/>
+              <w:start w:w="110" w:type="dxa"/>
+              <w:bottom w:w="90" w:type="dxa"/>
+              <w:end w:w="110" w:type="dxa"/>
+            </w:tcMar>
+            <w:vAlign w:val="center"/>
+            <w:shd w:fill="F2F6FA"/>
+          </w:tcPr>
+          <w:p>
+            <w:pPr>
+              <w:spacing w:line="240" w:lineRule="auto" w:after="0"/>
+              <w:jc w:val="center"/>
+            </w:pPr>
+            <w:r>
+              <w:rPr>
+                <w:rFonts w:ascii="Times New Roman" w:hAnsi="Times New Roman"/>
+                <w:b w:val="0"/>
+                <w:i w:val="0"/>
+                <w:color w:val="000000"/>
+                <w:sz w:val="19"/>
+              </w:rPr>
+              <w:t>5.1</w:t>
+            </w:r>
+          </w:p>
+        </w:tc>
+        <w:tc>
+          <w:tcPr>
+            <w:tcW w:type="dxa" w:w="7632"/>
+            <w:tcMar>
+              <w:top w:w="90" w:type="dxa"/>
+              <w:start w:w="110" w:type="dxa"/>
+              <w:bottom w:w="90" w:type="dxa"/>
+              <w:end w:w="110" w:type="dxa"/>
+            </w:tcMar>
+            <w:vAlign w:val="center"/>
+            <w:shd w:fill="F2F6FA"/>
+          </w:tcPr>
+          <w:p>
+            <w:pPr>
+              <w:spacing w:line="240" w:lineRule="auto" w:after="0"/>
+              <w:jc w:val="left"/>
+            </w:pPr>
+            <w:r>
+              <w:rPr>
+                <w:rFonts w:ascii="Times New Roman" w:hAnsi="Times New Roman"/>
+                <w:b w:val="0"/>
+                <w:i w:val="0"/>
+                <w:color w:val="000000"/>
+                <w:sz w:val="19"/>
+              </w:rPr>
+              <w:t>Dashboard navigation structure</w:t>
+            </w:r>
+          </w:p>
+        </w:tc>
+      </w:tr>
+      <w:tr>
+        <w:tc>
+          <w:tcPr>
+            <w:tcW w:type="dxa" w:w="1584"/>
+            <w:tcMar>
+              <w:top w:w="90" w:type="dxa"/>
+              <w:start w:w="110" w:type="dxa"/>
+              <w:bottom w:w="90" w:type="dxa"/>
+              <w:end w:w="110" w:type="dxa"/>
+            </w:tcMar>
+            <w:vAlign w:val="center"/>
+          </w:tcPr>
+          <w:p>
+            <w:pPr>
+              <w:spacing w:line="240" w:lineRule="auto" w:after="0"/>
+              <w:jc w:val="center"/>
+            </w:pPr>
+            <w:r>
+              <w:rPr>
+                <w:rFonts w:ascii="Times New Roman" w:hAnsi="Times New Roman"/>
+                <w:b w:val="0"/>
+                <w:i w:val="0"/>
+                <w:color w:val="000000"/>
+                <w:sz w:val="19"/>
+              </w:rPr>
+              <w:t>5.2</w:t>
+            </w:r>
+          </w:p>
+        </w:tc>
+        <w:tc>
+          <w:tcPr>
+            <w:tcW w:type="dxa" w:w="7632"/>
+            <w:tcMar>
+              <w:top w:w="90" w:type="dxa"/>
+              <w:start w:w="110" w:type="dxa"/>
+              <w:bottom w:w="90" w:type="dxa"/>
+              <w:end w:w="110" w:type="dxa"/>
+            </w:tcMar>
+            <w:vAlign w:val="center"/>
+          </w:tcPr>
+          <w:p>
+            <w:pPr>
+              <w:spacing w:line="240" w:lineRule="auto" w:after="0"/>
+              <w:jc w:val="left"/>
+            </w:pPr>
+            <w:r>
+              <w:rPr>
+                <w:rFonts w:ascii="Times New Roman" w:hAnsi="Times New Roman"/>
+                <w:b w:val="0"/>
+                <w:i w:val="0"/>
+                <w:color w:val="000000"/>
+                <w:sz w:val="19"/>
+              </w:rPr>
+              <w:t>Fund transaction state transition</w:t>
+            </w:r>
+          </w:p>
+        </w:tc>
+      </w:tr>
+    </w:tbl>
+    <w:p>
+      <w:pPr>
+        <w:spacing w:after="40"/>
+      </w:pPr>
+    </w:p>
+    <w:p>
+      <w:pPr>
+        <w:spacing w:after="240"/>
+        <w:jc w:val="center"/>
+      </w:pPr>
+      <w:r>
+        <w:rPr>
+          <w:rFonts w:ascii="Times New Roman" w:hAnsi="Times New Roman"/>
+          <w:b/>
+          <w:i w:val="0"/>
+          <w:color w:val="000000"/>
+          <w:sz w:val="28"/>
+        </w:rPr>
+        <w:t>LIST OF TABLES</w:t>
+      </w:r>
+    </w:p>
+    <w:tbl>
+      <w:tblPr>
+        <w:tblW w:type="auto" w:w="0"/>
+        <w:jc w:val="center"/>
+        <w:tblLayout w:type="fixed"/>
+        <w:tblLook w:firstColumn="1" w:firstRow="1" w:lastColumn="0" w:lastRow="0" w:noHBand="0" w:noVBand="1" w:val="04A0"/>
+        <w:tblBorders>
+          <w:top w:val="single" w:sz="6" w:color="D9D9D9"/>
+          <w:left w:val="single" w:sz="6" w:color="D9D9D9"/>
+          <w:bottom w:val="single" w:sz="6" w:color="D9D9D9"/>
+          <w:right w:val="single" w:sz="6" w:color="D9D9D9"/>
+          <w:insideH w:val="single" w:sz="6" w:color="D9D9D9"/>
+          <w:insideV w:val="single" w:sz="6" w:color="D9D9D9"/>
+        </w:tblBorders>
+      </w:tblPr>
+      <w:tblGrid>
+        <w:gridCol w:w="4262"/>
+        <w:gridCol w:w="4262"/>
+      </w:tblGrid>
+      <w:tr>
+        <w:trPr>
+          <w:tblHeader w:val="true"/>
+        </w:trPr>
+        <w:tc>
+          <w:tcPr>
+            <w:tcW w:type="dxa" w:w="1584"/>
+            <w:shd w:fill="1F4E78"/>
+            <w:tcMar>
+              <w:top w:w="90" w:type="dxa"/>
+              <w:start w:w="110" w:type="dxa"/>
+              <w:bottom w:w="90" w:type="dxa"/>
+              <w:end w:w="110" w:type="dxa"/>
+            </w:tcMar>
+            <w:vAlign w:val="center"/>
+          </w:tcPr>
+          <w:p>
+            <w:pPr>
+              <w:jc w:val="center"/>
+            </w:pPr>
+            <w:r>
+              <w:rPr>
+                <w:rFonts w:ascii="Times New Roman" w:hAnsi="Times New Roman"/>
+                <w:b/>
+                <w:i w:val="0"/>
+                <w:color w:val="FFFFFF"/>
+                <w:sz w:val="20"/>
+              </w:rPr>
+              <w:t>Table</w:t>
+            </w:r>
+          </w:p>
+        </w:tc>
+        <w:tc>
+          <w:tcPr>
+            <w:tcW w:type="dxa" w:w="7632"/>
+            <w:shd w:fill="1F4E78"/>
+            <w:tcMar>
+              <w:top w:w="90" w:type="dxa"/>
+              <w:start w:w="110" w:type="dxa"/>
+              <w:bottom w:w="90" w:type="dxa"/>
+              <w:end w:w="110" w:type="dxa"/>
+            </w:tcMar>
+            <w:vAlign w:val="center"/>
+          </w:tcPr>
+          <w:p>
+            <w:pPr>
+              <w:jc w:val="center"/>
+            </w:pPr>
+            <w:r>
+              <w:rPr>
+                <w:rFonts w:ascii="Times New Roman" w:hAnsi="Times New Roman"/>
+                <w:b/>
+                <w:i w:val="0"/>
+                <w:color w:val="FFFFFF"/>
+                <w:sz w:val="20"/>
+              </w:rPr>
+              <w:t>Title</w:t>
+            </w:r>
+          </w:p>
+        </w:tc>
+      </w:tr>
+      <w:tr>
+        <w:tc>
+          <w:tcPr>
+            <w:tcW w:type="dxa" w:w="1584"/>
+            <w:tcMar>
+              <w:top w:w="90" w:type="dxa"/>
+              <w:start w:w="110" w:type="dxa"/>
+              <w:bottom w:w="90" w:type="dxa"/>
+              <w:end w:w="110" w:type="dxa"/>
+            </w:tcMar>
+            <w:vAlign w:val="center"/>
+          </w:tcPr>
+          <w:p>
+            <w:pPr>
+              <w:spacing w:line="240" w:lineRule="auto" w:after="0"/>
+              <w:jc w:val="center"/>
+            </w:pPr>
+            <w:r>
+              <w:rPr>
+                <w:rFonts w:ascii="Times New Roman" w:hAnsi="Times New Roman"/>
+                <w:b w:val="0"/>
+                <w:i w:val="0"/>
+                <w:color w:val="000000"/>
+                <w:sz w:val="19"/>
+              </w:rPr>
+              <w:t>2.1</w:t>
+            </w:r>
+          </w:p>
+        </w:tc>
+        <w:tc>
+          <w:tcPr>
+            <w:tcW w:type="dxa" w:w="7632"/>
+            <w:tcMar>
+              <w:top w:w="90" w:type="dxa"/>
+              <w:start w:w="110" w:type="dxa"/>
+              <w:bottom w:w="90" w:type="dxa"/>
+              <w:end w:w="110" w:type="dxa"/>
+            </w:tcMar>
+            <w:vAlign w:val="center"/>
+          </w:tcPr>
+          <w:p>
+            <w:pPr>
+              <w:spacing w:line="240" w:lineRule="auto" w:after="0"/>
+              <w:jc w:val="left"/>
+            </w:pPr>
+            <w:r>
+              <w:rPr>
+                <w:rFonts w:ascii="Times New Roman" w:hAnsi="Times New Roman"/>
+                <w:b w:val="0"/>
+                <w:i w:val="0"/>
+                <w:color w:val="000000"/>
+                <w:sz w:val="19"/>
+              </w:rPr>
+              <w:t>Comparison of the existing and proposed approaches</w:t>
+            </w:r>
+          </w:p>
+        </w:tc>
+      </w:tr>
+      <w:tr>
+        <w:tc>
+          <w:tcPr>
+            <w:tcW w:type="dxa" w:w="1584"/>
+            <w:tcMar>
+              <w:top w:w="90" w:type="dxa"/>
+              <w:start w:w="110" w:type="dxa"/>
+              <w:bottom w:w="90" w:type="dxa"/>
+              <w:end w:w="110" w:type="dxa"/>
+            </w:tcMar>
+            <w:vAlign w:val="center"/>
+            <w:shd w:fill="F2F6FA"/>
+          </w:tcPr>
+          <w:p>
+            <w:pPr>
+              <w:spacing w:line="240" w:lineRule="auto" w:after="0"/>
+              <w:jc w:val="center"/>
+            </w:pPr>
+            <w:r>
+              <w:rPr>
+                <w:rFonts w:ascii="Times New Roman" w:hAnsi="Times New Roman"/>
+                <w:b w:val="0"/>
+                <w:i w:val="0"/>
+                <w:color w:val="000000"/>
+                <w:sz w:val="19"/>
+              </w:rPr>
+              <w:t>3.1</w:t>
+            </w:r>
+          </w:p>
+        </w:tc>
+        <w:tc>
+          <w:tcPr>
+            <w:tcW w:type="dxa" w:w="7632"/>
+            <w:tcMar>
+              <w:top w:w="90" w:type="dxa"/>
+              <w:start w:w="110" w:type="dxa"/>
+              <w:bottom w:w="90" w:type="dxa"/>
+              <w:end w:w="110" w:type="dxa"/>
+            </w:tcMar>
+            <w:vAlign w:val="center"/>
+            <w:shd w:fill="F2F6FA"/>
+          </w:tcPr>
+          <w:p>
+            <w:pPr>
+              <w:spacing w:line="240" w:lineRule="auto" w:after="0"/>
+              <w:jc w:val="center"/>
+            </w:pPr>
+            <w:r>
+              <w:rPr>
+                <w:rFonts w:ascii="Times New Roman" w:hAnsi="Times New Roman"/>
+                <w:b w:val="0"/>
+                <w:i w:val="0"/>
+                <w:color w:val="000000"/>
+                <w:sz w:val="19"/>
+              </w:rPr>
+              <w:t>Functional requirements</w:t>
+            </w:r>
+          </w:p>
+        </w:tc>
+      </w:tr>
+      <w:tr>
+        <w:tc>
+          <w:tcPr>
+            <w:tcW w:type="dxa" w:w="1584"/>
+            <w:tcMar>
+              <w:top w:w="90" w:type="dxa"/>
+              <w:start w:w="110" w:type="dxa"/>
+              <w:bottom w:w="90" w:type="dxa"/>
+              <w:end w:w="110" w:type="dxa"/>
+            </w:tcMar>
+            <w:vAlign w:val="center"/>
+          </w:tcPr>
+          <w:p>
+            <w:pPr>
+              <w:spacing w:line="240" w:lineRule="auto" w:after="0"/>
+              <w:jc w:val="center"/>
+            </w:pPr>
+            <w:r>
+              <w:rPr>
+                <w:rFonts w:ascii="Times New Roman" w:hAnsi="Times New Roman"/>
+                <w:b w:val="0"/>
+                <w:i w:val="0"/>
+                <w:color w:val="000000"/>
+                <w:sz w:val="19"/>
+              </w:rPr>
+              <w:t>3.2</w:t>
+            </w:r>
+          </w:p>
+        </w:tc>
+        <w:tc>
+          <w:tcPr>
+            <w:tcW w:type="dxa" w:w="7632"/>
+            <w:tcMar>
+              <w:top w:w="90" w:type="dxa"/>
+              <w:start w:w="110" w:type="dxa"/>
+              <w:bottom w:w="90" w:type="dxa"/>
+              <w:end w:w="110" w:type="dxa"/>
+            </w:tcMar>
+            <w:vAlign w:val="center"/>
+          </w:tcPr>
+          <w:p>
+            <w:pPr>
+              <w:spacing w:line="240" w:lineRule="auto" w:after="0"/>
+              <w:jc w:val="left"/>
+            </w:pPr>
+            <w:r>
+              <w:rPr>
+                <w:rFonts w:ascii="Times New Roman" w:hAnsi="Times New Roman"/>
+                <w:b w:val="0"/>
+                <w:i w:val="0"/>
+                <w:color w:val="000000"/>
+                <w:sz w:val="19"/>
+              </w:rPr>
+              <w:t>Non-functional requirements</w:t>
+            </w:r>
+          </w:p>
+        </w:tc>
+      </w:tr>
+      <w:tr>
+        <w:tc>
+          <w:tcPr>
+            <w:tcW w:type="dxa" w:w="1584"/>
+            <w:tcMar>
+              <w:top w:w="90" w:type="dxa"/>
+              <w:start w:w="110" w:type="dxa"/>
+              <w:bottom w:w="90" w:type="dxa"/>
+              <w:end w:w="110" w:type="dxa"/>
+            </w:tcMar>
+            <w:vAlign w:val="center"/>
+            <w:shd w:fill="F2F6FA"/>
+          </w:tcPr>
+          <w:p>
+            <w:pPr>
+              <w:spacing w:line="240" w:lineRule="auto" w:after="0"/>
+              <w:jc w:val="center"/>
+            </w:pPr>
+            <w:r>
+              <w:rPr>
+                <w:rFonts w:ascii="Times New Roman" w:hAnsi="Times New Roman"/>
+                <w:b w:val="0"/>
+                <w:i w:val="0"/>
+                <w:color w:val="000000"/>
+                <w:sz w:val="19"/>
+              </w:rPr>
+              <w:t>3.3</w:t>
+            </w:r>
+          </w:p>
+        </w:tc>
+        <w:tc>
+          <w:tcPr>
+            <w:tcW w:type="dxa" w:w="7632"/>
+            <w:tcMar>
+              <w:top w:w="90" w:type="dxa"/>
+              <w:start w:w="110" w:type="dxa"/>
+              <w:bottom w:w="90" w:type="dxa"/>
+              <w:end w:w="110" w:type="dxa"/>
+            </w:tcMar>
+            <w:vAlign w:val="center"/>
+            <w:shd w:fill="F2F6FA"/>
+          </w:tcPr>
+          <w:p>
+            <w:pPr>
+              <w:spacing w:line="240" w:lineRule="auto" w:after="0"/>
+              <w:jc w:val="left"/>
+            </w:pPr>
+            <w:r>
+              <w:rPr>
+                <w:rFonts w:ascii="Times New Roman" w:hAnsi="Times New Roman"/>
+                <w:b w:val="0"/>
+                <w:i w:val="0"/>
+                <w:color w:val="000000"/>
+                <w:sz w:val="19"/>
+              </w:rPr>
+              <w:t>Hardware and software requirements</w:t>
+            </w:r>
+          </w:p>
+        </w:tc>
+      </w:tr>
+      <w:tr>
+        <w:tc>
+          <w:tcPr>
+            <w:tcW w:type="dxa" w:w="1584"/>
+            <w:tcMar>
+              <w:top w:w="90" w:type="dxa"/>
+              <w:start w:w="110" w:type="dxa"/>
+              <w:bottom w:w="90" w:type="dxa"/>
+              <w:end w:w="110" w:type="dxa"/>
+            </w:tcMar>
+            <w:vAlign w:val="center"/>
+          </w:tcPr>
+          <w:p>
+            <w:pPr>
+              <w:spacing w:line="240" w:lineRule="auto" w:after="0"/>
+              <w:jc w:val="center"/>
+            </w:pPr>
+            <w:r>
+              <w:rPr>
+                <w:rFonts w:ascii="Times New Roman" w:hAnsi="Times New Roman"/>
+                <w:b w:val="0"/>
+                <w:i w:val="0"/>
+                <w:color w:val="000000"/>
+                <w:sz w:val="19"/>
+              </w:rPr>
+              <w:t>4.1</w:t>
+            </w:r>
+          </w:p>
+        </w:tc>
+        <w:tc>
+          <w:tcPr>
+            <w:tcW w:type="dxa" w:w="7632"/>
+            <w:tcMar>
+              <w:top w:w="90" w:type="dxa"/>
+              <w:start w:w="110" w:type="dxa"/>
+              <w:bottom w:w="90" w:type="dxa"/>
+              <w:end w:w="110" w:type="dxa"/>
+            </w:tcMar>
+            <w:vAlign w:val="center"/>
+          </w:tcPr>
+          <w:p>
+            <w:pPr>
+              <w:spacing w:line="240" w:lineRule="auto" w:after="0"/>
+              <w:jc w:val="center"/>
+            </w:pPr>
+            <w:r>
+              <w:rPr>
+                <w:rFonts w:ascii="Times New Roman" w:hAnsi="Times New Roman"/>
+                <w:b w:val="0"/>
+                <w:i w:val="0"/>
+                <w:color w:val="000000"/>
+                <w:sz w:val="19"/>
+              </w:rPr>
+              <w:t>Primary data entities</w:t>
+            </w:r>
+          </w:p>
+        </w:tc>
+      </w:tr>
+      <w:tr>
+        <w:tc>
+          <w:tcPr>
+            <w:tcW w:type="dxa" w:w="1584"/>
+            <w:tcMar>
+              <w:top w:w="90" w:type="dxa"/>
+              <w:start w:w="110" w:type="dxa"/>
+              <w:bottom w:w="90" w:type="dxa"/>
+              <w:end w:w="110" w:type="dxa"/>
+            </w:tcMar>
+            <w:vAlign w:val="center"/>
+            <w:shd w:fill="F2F6FA"/>
+          </w:tcPr>
+          <w:p>
+            <w:pPr>
+              <w:spacing w:line="240" w:lineRule="auto" w:after="0"/>
+              <w:jc w:val="center"/>
+            </w:pPr>
+            <w:r>
+              <w:rPr>
+                <w:rFonts w:ascii="Times New Roman" w:hAnsi="Times New Roman"/>
+                <w:b w:val="0"/>
+                <w:i w:val="0"/>
+                <w:color w:val="000000"/>
+                <w:sz w:val="19"/>
+              </w:rPr>
+              <w:t>5.1</w:t>
+            </w:r>
+          </w:p>
+        </w:tc>
+        <w:tc>
+          <w:tcPr>
+            <w:tcW w:type="dxa" w:w="7632"/>
+            <w:tcMar>
+              <w:top w:w="90" w:type="dxa"/>
+              <w:start w:w="110" w:type="dxa"/>
+              <w:bottom w:w="90" w:type="dxa"/>
+              <w:end w:w="110" w:type="dxa"/>
+            </w:tcMar>
+            <w:vAlign w:val="center"/>
+            <w:shd w:fill="F2F6FA"/>
+          </w:tcPr>
+          <w:p>
+            <w:pPr>
+              <w:spacing w:line="240" w:lineRule="auto" w:after="0"/>
+              <w:jc w:val="center"/>
+            </w:pPr>
+            <w:r>
+              <w:rPr>
+                <w:rFonts w:ascii="Times New Roman" w:hAnsi="Times New Roman"/>
+                <w:b w:val="0"/>
+                <w:i w:val="0"/>
+                <w:color w:val="000000"/>
+                <w:sz w:val="19"/>
+              </w:rPr>
+              <w:t>Main application modules</w:t>
+            </w:r>
+          </w:p>
+        </w:tc>
+      </w:tr>
+      <w:tr>
+        <w:tc>
+          <w:tcPr>
+            <w:tcW w:type="dxa" w:w="1584"/>
+            <w:tcMar>
+              <w:top w:w="90" w:type="dxa"/>
+              <w:start w:w="110" w:type="dxa"/>
+              <w:bottom w:w="90" w:type="dxa"/>
+              <w:end w:w="110" w:type="dxa"/>
+            </w:tcMar>
+            <w:vAlign w:val="center"/>
+          </w:tcPr>
+          <w:p>
+            <w:pPr>
+              <w:spacing w:line="240" w:lineRule="auto" w:after="0"/>
+              <w:jc w:val="center"/>
+            </w:pPr>
+            <w:r>
+              <w:rPr>
+                <w:rFonts w:ascii="Times New Roman" w:hAnsi="Times New Roman"/>
+                <w:b w:val="0"/>
+                <w:i w:val="0"/>
+                <w:color w:val="000000"/>
+                <w:sz w:val="19"/>
+              </w:rPr>
+              <w:t>6.1</w:t>
+            </w:r>
+          </w:p>
+        </w:tc>
+        <w:tc>
+          <w:tcPr>
+            <w:tcW w:type="dxa" w:w="7632"/>
+            <w:tcMar>
+              <w:top w:w="90" w:type="dxa"/>
+              <w:start w:w="110" w:type="dxa"/>
+              <w:bottom w:w="90" w:type="dxa"/>
+              <w:end w:w="110" w:type="dxa"/>
+            </w:tcMar>
+            <w:vAlign w:val="center"/>
+          </w:tcPr>
+          <w:p>
+            <w:pPr>
+              <w:spacing w:line="240" w:lineRule="auto" w:after="0"/>
+              <w:jc w:val="center"/>
+            </w:pPr>
+            <w:r>
+              <w:rPr>
+                <w:rFonts w:ascii="Times New Roman" w:hAnsi="Times New Roman"/>
+                <w:b w:val="0"/>
+                <w:i w:val="0"/>
+                <w:color w:val="000000"/>
+                <w:sz w:val="19"/>
+              </w:rPr>
+              <w:t>Functional test cases</w:t>
+            </w:r>
+          </w:p>
+        </w:tc>
+      </w:tr>
+      <w:tr>
+        <w:tc>
+          <w:tcPr>
+            <w:tcW w:type="dxa" w:w="1584"/>
+            <w:tcMar>
+              <w:top w:w="90" w:type="dxa"/>
+              <w:start w:w="110" w:type="dxa"/>
+              <w:bottom w:w="90" w:type="dxa"/>
+              <w:end w:w="110" w:type="dxa"/>
+            </w:tcMar>
+            <w:vAlign w:val="center"/>
+            <w:shd w:fill="F2F6FA"/>
+          </w:tcPr>
+          <w:p>
+            <w:pPr>
+              <w:spacing w:line="240" w:lineRule="auto" w:after="0"/>
+              <w:jc w:val="center"/>
+            </w:pPr>
+            <w:r>
+              <w:rPr>
+                <w:rFonts w:ascii="Times New Roman" w:hAnsi="Times New Roman"/>
+                <w:b w:val="0"/>
+                <w:i w:val="0"/>
+                <w:color w:val="000000"/>
+                <w:sz w:val="19"/>
+              </w:rPr>
+              <w:t>6.2</w:t>
+            </w:r>
+          </w:p>
+        </w:tc>
+        <w:tc>
+          <w:tcPr>
+            <w:tcW w:type="dxa" w:w="7632"/>
+            <w:tcMar>
+              <w:top w:w="90" w:type="dxa"/>
+              <w:start w:w="110" w:type="dxa"/>
+              <w:bottom w:w="90" w:type="dxa"/>
+              <w:end w:w="110" w:type="dxa"/>
+            </w:tcMar>
+            <w:vAlign w:val="center"/>
+            <w:shd w:fill="F2F6FA"/>
+          </w:tcPr>
+          <w:p>
+            <w:pPr>
+              <w:spacing w:line="240" w:lineRule="auto" w:after="0"/>
+              <w:jc w:val="left"/>
+            </w:pPr>
+            <w:r>
+              <w:rPr>
+                <w:rFonts w:ascii="Times New Roman" w:hAnsi="Times New Roman"/>
+                <w:b w:val="0"/>
+                <w:i w:val="0"/>
+                <w:color w:val="000000"/>
+                <w:sz w:val="19"/>
+              </w:rPr>
+              <w:t>Build and verification results</w:t>
+            </w:r>
+          </w:p>
+        </w:tc>
+      </w:tr>
+      <w:tr>
+        <w:tc>
+          <w:tcPr>
+            <w:tcW w:type="dxa" w:w="1584"/>
+            <w:tcMar>
+              <w:top w:w="90" w:type="dxa"/>
+              <w:start w:w="110" w:type="dxa"/>
+              <w:bottom w:w="90" w:type="dxa"/>
+              <w:end w:w="110" w:type="dxa"/>
+            </w:tcMar>
+            <w:vAlign w:val="center"/>
+          </w:tcPr>
+          <w:p>
+            <w:pPr>
+              <w:spacing w:line="240" w:lineRule="auto" w:after="0"/>
+              <w:jc w:val="center"/>
+            </w:pPr>
+            <w:r>
+              <w:rPr>
+                <w:rFonts w:ascii="Times New Roman" w:hAnsi="Times New Roman"/>
+                <w:b w:val="0"/>
+                <w:i w:val="0"/>
+                <w:color w:val="000000"/>
+                <w:sz w:val="19"/>
+              </w:rPr>
+              <w:t>7.1</w:t>
+            </w:r>
+          </w:p>
+        </w:tc>
+        <w:tc>
+          <w:tcPr>
+            <w:tcW w:type="dxa" w:w="7632"/>
+            <w:tcMar>
+              <w:top w:w="90" w:type="dxa"/>
+              <w:start w:w="110" w:type="dxa"/>
+              <w:bottom w:w="90" w:type="dxa"/>
+              <w:end w:w="110" w:type="dxa"/>
+            </w:tcMar>
+            <w:vAlign w:val="center"/>
+          </w:tcPr>
+          <w:p>
+            <w:pPr>
+              <w:spacing w:line="240" w:lineRule="auto" w:after="0"/>
+              <w:jc w:val="left"/>
+            </w:pPr>
+            <w:r>
+              <w:rPr>
+                <w:rFonts w:ascii="Times New Roman" w:hAnsi="Times New Roman"/>
+                <w:b w:val="0"/>
+                <w:i w:val="0"/>
+                <w:color w:val="000000"/>
+                <w:sz w:val="19"/>
+              </w:rPr>
+              <w:t>Risk and mitigation summary</w:t>
+            </w:r>
+          </w:p>
+        </w:tc>
+      </w:tr>
+    </w:tbl>
+    <w:p>
+      <w:pPr>
+        <w:spacing w:after="40"/>
+      </w:pPr>
+    </w:p>
+    <w:p>
+      <w:r>
+        <w:br w:type="page"/>
+      </w:r>
+    </w:p>
+    <w:p>
+      <w:pPr>
+        <w:spacing w:after="240"/>
+        <w:jc w:val="center"/>
+      </w:pPr>
+      <w:r>
+        <w:rPr>
+          <w:rFonts w:ascii="Times New Roman" w:hAnsi="Times New Roman"/>
+          <w:b/>
+          <w:i w:val="0"/>
+          <w:color w:val="000000"/>
+          <w:sz w:val="28"/>
+        </w:rPr>
+        <w:t>LIST OF ABBREVIATIONS</w:t>
+      </w:r>
+    </w:p>
+    <w:tbl>
+      <w:tblPr>
+        <w:tblW w:type="auto" w:w="0"/>
+        <w:jc w:val="center"/>
+        <w:tblLayout w:type="fixed"/>
+        <w:tblLook w:firstColumn="1" w:firstRow="1" w:lastColumn="0" w:lastRow="0" w:noHBand="0" w:noVBand="1" w:val="04A0"/>
+        <w:tblBorders>
+          <w:top w:val="single" w:sz="6" w:color="D9D9D9"/>
+          <w:left w:val="single" w:sz="6" w:color="D9D9D9"/>
+          <w:bottom w:val="single" w:sz="6" w:color="D9D9D9"/>
+          <w:right w:val="single" w:sz="6" w:color="D9D9D9"/>
+          <w:insideH w:val="single" w:sz="6" w:color="D9D9D9"/>
+          <w:insideV w:val="single" w:sz="6" w:color="D9D9D9"/>
+        </w:tblBorders>
+      </w:tblPr>
+      <w:tblGrid>
+        <w:gridCol w:w="4262"/>
+        <w:gridCol w:w="4262"/>
+      </w:tblGrid>
+      <w:tr>
+        <w:trPr>
+          <w:tblHeader w:val="true"/>
+        </w:trPr>
+        <w:tc>
+          <w:tcPr>
+            <w:tcW w:type="dxa" w:w="2160"/>
+            <w:shd w:fill="1F4E78"/>
+            <w:tcMar>
+              <w:top w:w="90" w:type="dxa"/>
+              <w:start w:w="110" w:type="dxa"/>
+              <w:bottom w:w="90" w:type="dxa"/>
+              <w:end w:w="110" w:type="dxa"/>
+            </w:tcMar>
+            <w:vAlign w:val="center"/>
+          </w:tcPr>
+          <w:p>
+            <w:pPr>
+              <w:jc w:val="center"/>
+            </w:pPr>
+            <w:r>
+              <w:rPr>
+                <w:rFonts w:ascii="Times New Roman" w:hAnsi="Times New Roman"/>
+                <w:b/>
+                <w:i w:val="0"/>
+                <w:color w:val="FFFFFF"/>
+                <w:sz w:val="20"/>
+              </w:rPr>
+              <w:t>Abbreviation</w:t>
+            </w:r>
+          </w:p>
+        </w:tc>
+        <w:tc>
+          <w:tcPr>
+            <w:tcW w:type="dxa" w:w="7056"/>
+            <w:shd w:fill="1F4E78"/>
+            <w:tcMar>
+              <w:top w:w="90" w:type="dxa"/>
+              <w:start w:w="110" w:type="dxa"/>
+              <w:bottom w:w="90" w:type="dxa"/>
+              <w:end w:w="110" w:type="dxa"/>
+            </w:tcMar>
+            <w:vAlign w:val="center"/>
+          </w:tcPr>
+          <w:p>
+            <w:pPr>
+              <w:jc w:val="center"/>
+            </w:pPr>
+            <w:r>
+              <w:rPr>
+                <w:rFonts w:ascii="Times New Roman" w:hAnsi="Times New Roman"/>
+                <w:b/>
+                <w:i w:val="0"/>
+                <w:color w:val="FFFFFF"/>
+                <w:sz w:val="20"/>
+              </w:rPr>
+              <w:t>Meaning</w:t>
+            </w:r>
+          </w:p>
+        </w:tc>
+      </w:tr>
+      <w:tr>
+        <w:tc>
+          <w:tcPr>
+            <w:tcW w:type="dxa" w:w="2160"/>
+            <w:tcMar>
+              <w:top w:w="90" w:type="dxa"/>
+              <w:start w:w="110" w:type="dxa"/>
+              <w:bottom w:w="90" w:type="dxa"/>
+              <w:end w:w="110" w:type="dxa"/>
+            </w:tcMar>
+            <w:vAlign w:val="center"/>
+          </w:tcPr>
+          <w:p>
+            <w:pPr>
+              <w:spacing w:line="240" w:lineRule="auto" w:after="0"/>
+              <w:jc w:val="center"/>
+            </w:pPr>
+            <w:r>
+              <w:rPr>
+                <w:rFonts w:ascii="Times New Roman" w:hAnsi="Times New Roman"/>
+                <w:b w:val="0"/>
+                <w:i w:val="0"/>
+                <w:color w:val="000000"/>
+                <w:sz w:val="19"/>
+              </w:rPr>
+              <w:t>API</w:t>
+            </w:r>
+          </w:p>
+        </w:tc>
+        <w:tc>
+          <w:tcPr>
+            <w:tcW w:type="dxa" w:w="7056"/>
+            <w:tcMar>
+              <w:top w:w="90" w:type="dxa"/>
+              <w:start w:w="110" w:type="dxa"/>
+              <w:bottom w:w="90" w:type="dxa"/>
+              <w:end w:w="110" w:type="dxa"/>
+            </w:tcMar>
+            <w:vAlign w:val="center"/>
+          </w:tcPr>
+          <w:p>
+            <w:pPr>
+              <w:spacing w:line="240" w:lineRule="auto" w:after="0"/>
+              <w:jc w:val="left"/>
+            </w:pPr>
+            <w:r>
+              <w:rPr>
+                <w:rFonts w:ascii="Times New Roman" w:hAnsi="Times New Roman"/>
+                <w:b w:val="0"/>
+                <w:i w:val="0"/>
+                <w:color w:val="000000"/>
+                <w:sz w:val="19"/>
+              </w:rPr>
+              <w:t>Application Programming Interface</w:t>
+            </w:r>
+          </w:p>
+        </w:tc>
+      </w:tr>
+      <w:tr>
+        <w:tc>
+          <w:tcPr>
+            <w:tcW w:type="dxa" w:w="2160"/>
+            <w:tcMar>
+              <w:top w:w="90" w:type="dxa"/>
+              <w:start w:w="110" w:type="dxa"/>
+              <w:bottom w:w="90" w:type="dxa"/>
+              <w:end w:w="110" w:type="dxa"/>
+            </w:tcMar>
+            <w:vAlign w:val="center"/>
+            <w:shd w:fill="F2F6FA"/>
+          </w:tcPr>
+          <w:p>
+            <w:pPr>
+              <w:spacing w:line="240" w:lineRule="auto" w:after="0"/>
+              <w:jc w:val="center"/>
+            </w:pPr>
+            <w:r>
+              <w:rPr>
+                <w:rFonts w:ascii="Times New Roman" w:hAnsi="Times New Roman"/>
+                <w:b w:val="0"/>
+                <w:i w:val="0"/>
+                <w:color w:val="000000"/>
+                <w:sz w:val="19"/>
+              </w:rPr>
+              <w:t>CRUD</w:t>
+            </w:r>
+          </w:p>
+        </w:tc>
+        <w:tc>
+          <w:tcPr>
+            <w:tcW w:type="dxa" w:w="7056"/>
+            <w:tcMar>
+              <w:top w:w="90" w:type="dxa"/>
+              <w:start w:w="110" w:type="dxa"/>
+              <w:bottom w:w="90" w:type="dxa"/>
+              <w:end w:w="110" w:type="dxa"/>
+            </w:tcMar>
+            <w:vAlign w:val="center"/>
+            <w:shd w:fill="F2F6FA"/>
+          </w:tcPr>
+          <w:p>
+            <w:pPr>
+              <w:spacing w:line="240" w:lineRule="auto" w:after="0"/>
+              <w:jc w:val="left"/>
+            </w:pPr>
+            <w:r>
+              <w:rPr>
+                <w:rFonts w:ascii="Times New Roman" w:hAnsi="Times New Roman"/>
+                <w:b w:val="0"/>
+                <w:i w:val="0"/>
+                <w:color w:val="000000"/>
+                <w:sz w:val="19"/>
+              </w:rPr>
+              <w:t>Create Read Update Delete</w:t>
+            </w:r>
+          </w:p>
+        </w:tc>
+      </w:tr>
+      <w:tr>
+        <w:tc>
+          <w:tcPr>
+            <w:tcW w:type="dxa" w:w="2160"/>
+            <w:tcMar>
+              <w:top w:w="90" w:type="dxa"/>
+              <w:start w:w="110" w:type="dxa"/>
+              <w:bottom w:w="90" w:type="dxa"/>
+              <w:end w:w="110" w:type="dxa"/>
+            </w:tcMar>
+            <w:vAlign w:val="center"/>
+          </w:tcPr>
+          <w:p>
+            <w:pPr>
+              <w:spacing w:line="240" w:lineRule="auto" w:after="0"/>
+              <w:jc w:val="center"/>
+            </w:pPr>
+            <w:r>
+              <w:rPr>
+                <w:rFonts w:ascii="Times New Roman" w:hAnsi="Times New Roman"/>
+                <w:b w:val="0"/>
+                <w:i w:val="0"/>
+                <w:color w:val="000000"/>
+                <w:sz w:val="19"/>
+              </w:rPr>
+              <w:t>HMAC</w:t>
+            </w:r>
+          </w:p>
+        </w:tc>
+        <w:tc>
+          <w:tcPr>
+            <w:tcW w:type="dxa" w:w="7056"/>
+            <w:tcMar>
+              <w:top w:w="90" w:type="dxa"/>
+              <w:start w:w="110" w:type="dxa"/>
+              <w:bottom w:w="90" w:type="dxa"/>
+              <w:end w:w="110" w:type="dxa"/>
+            </w:tcMar>
+            <w:vAlign w:val="center"/>
+          </w:tcPr>
+          <w:p>
+            <w:pPr>
+              <w:spacing w:line="240" w:lineRule="auto" w:after="0"/>
+              <w:jc w:val="left"/>
+            </w:pPr>
+            <w:r>
+              <w:rPr>
+                <w:rFonts w:ascii="Times New Roman" w:hAnsi="Times New Roman"/>
+                <w:b w:val="0"/>
+                <w:i w:val="0"/>
+                <w:color w:val="000000"/>
+                <w:sz w:val="19"/>
+              </w:rPr>
+              <w:t>Hash based Message Authentication Code</w:t>
+            </w:r>
+          </w:p>
+        </w:tc>
+      </w:tr>
+      <w:tr>
+        <w:tc>
+          <w:tcPr>
+            <w:tcW w:type="dxa" w:w="2160"/>
+            <w:tcMar>
+              <w:top w:w="90" w:type="dxa"/>
+              <w:start w:w="110" w:type="dxa"/>
+              <w:bottom w:w="90" w:type="dxa"/>
+              <w:end w:w="110" w:type="dxa"/>
+            </w:tcMar>
+            <w:vAlign w:val="center"/>
+            <w:shd w:fill="F2F6FA"/>
+          </w:tcPr>
+          <w:p>
+            <w:pPr>
+              <w:spacing w:line="240" w:lineRule="auto" w:after="0"/>
+              <w:jc w:val="center"/>
+            </w:pPr>
+            <w:r>
+              <w:rPr>
+                <w:rFonts w:ascii="Times New Roman" w:hAnsi="Times New Roman"/>
+                <w:b w:val="0"/>
+                <w:i w:val="0"/>
+                <w:color w:val="000000"/>
+                <w:sz w:val="19"/>
+              </w:rPr>
+              <w:t>HTTP</w:t>
+            </w:r>
+          </w:p>
+        </w:tc>
+        <w:tc>
+          <w:tcPr>
+            <w:tcW w:type="dxa" w:w="7056"/>
+            <w:tcMar>
+              <w:top w:w="90" w:type="dxa"/>
+              <w:start w:w="110" w:type="dxa"/>
+              <w:bottom w:w="90" w:type="dxa"/>
+              <w:end w:w="110" w:type="dxa"/>
+            </w:tcMar>
+            <w:vAlign w:val="center"/>
+            <w:shd w:fill="F2F6FA"/>
+          </w:tcPr>
+          <w:p>
+            <w:pPr>
+              <w:spacing w:line="240" w:lineRule="auto" w:after="0"/>
+              <w:jc w:val="left"/>
+            </w:pPr>
+            <w:r>
+              <w:rPr>
+                <w:rFonts w:ascii="Times New Roman" w:hAnsi="Times New Roman"/>
+                <w:b w:val="0"/>
+                <w:i w:val="0"/>
+                <w:color w:val="000000"/>
+                <w:sz w:val="19"/>
+              </w:rPr>
+              <w:t>Hypertext Transfer Protocol</w:t>
+            </w:r>
+          </w:p>
+        </w:tc>
+      </w:tr>
+      <w:tr>
+        <w:tc>
+          <w:tcPr>
+            <w:tcW w:type="dxa" w:w="2160"/>
+            <w:tcMar>
+              <w:top w:w="90" w:type="dxa"/>
+              <w:start w:w="110" w:type="dxa"/>
+              <w:bottom w:w="90" w:type="dxa"/>
+              <w:end w:w="110" w:type="dxa"/>
+            </w:tcMar>
+            <w:vAlign w:val="center"/>
+          </w:tcPr>
+          <w:p>
+            <w:pPr>
+              <w:spacing w:line="240" w:lineRule="auto" w:after="0"/>
+              <w:jc w:val="center"/>
+            </w:pPr>
+            <w:r>
+              <w:rPr>
+                <w:rFonts w:ascii="Times New Roman" w:hAnsi="Times New Roman"/>
+                <w:b w:val="0"/>
+                <w:i w:val="0"/>
+                <w:color w:val="000000"/>
+                <w:sz w:val="19"/>
+              </w:rPr>
+              <w:t>INR</w:t>
+            </w:r>
+          </w:p>
+        </w:tc>
+        <w:tc>
+          <w:tcPr>
+            <w:tcW w:type="dxa" w:w="7056"/>
+            <w:tcMar>
+              <w:top w:w="90" w:type="dxa"/>
+              <w:start w:w="110" w:type="dxa"/>
+              <w:bottom w:w="90" w:type="dxa"/>
+              <w:end w:w="110" w:type="dxa"/>
+            </w:tcMar>
+            <w:vAlign w:val="center"/>
+          </w:tcPr>
+          <w:p>
+            <w:pPr>
+              <w:spacing w:line="240" w:lineRule="auto" w:after="0"/>
+              <w:jc w:val="center"/>
+            </w:pPr>
+            <w:r>
+              <w:rPr>
+                <w:rFonts w:ascii="Times New Roman" w:hAnsi="Times New Roman"/>
+                <w:b w:val="0"/>
+                <w:i w:val="0"/>
+                <w:color w:val="000000"/>
+                <w:sz w:val="19"/>
+              </w:rPr>
+              <w:t>Indian Rupee</w:t>
+            </w:r>
+          </w:p>
+        </w:tc>
+      </w:tr>
+      <w:tr>
+        <w:tc>
+          <w:tcPr>
+            <w:tcW w:type="dxa" w:w="2160"/>
+            <w:tcMar>
+              <w:top w:w="90" w:type="dxa"/>
+              <w:start w:w="110" w:type="dxa"/>
+              <w:bottom w:w="90" w:type="dxa"/>
+              <w:end w:w="110" w:type="dxa"/>
+            </w:tcMar>
+            <w:vAlign w:val="center"/>
+            <w:shd w:fill="F2F6FA"/>
+          </w:tcPr>
+          <w:p>
+            <w:pPr>
+              <w:spacing w:line="240" w:lineRule="auto" w:after="0"/>
+              <w:jc w:val="center"/>
+            </w:pPr>
+            <w:r>
+              <w:rPr>
+                <w:rFonts w:ascii="Times New Roman" w:hAnsi="Times New Roman"/>
+                <w:b w:val="0"/>
+                <w:i w:val="0"/>
+                <w:color w:val="000000"/>
+                <w:sz w:val="19"/>
+              </w:rPr>
+              <w:t>JSON</w:t>
+            </w:r>
+          </w:p>
+        </w:tc>
+        <w:tc>
+          <w:tcPr>
+            <w:tcW w:type="dxa" w:w="7056"/>
+            <w:tcMar>
+              <w:top w:w="90" w:type="dxa"/>
+              <w:start w:w="110" w:type="dxa"/>
+              <w:bottom w:w="90" w:type="dxa"/>
+              <w:end w:w="110" w:type="dxa"/>
+            </w:tcMar>
+            <w:vAlign w:val="center"/>
+            <w:shd w:fill="F2F6FA"/>
+          </w:tcPr>
+          <w:p>
+            <w:pPr>
+              <w:spacing w:line="240" w:lineRule="auto" w:after="0"/>
+              <w:jc w:val="left"/>
+            </w:pPr>
+            <w:r>
+              <w:rPr>
+                <w:rFonts w:ascii="Times New Roman" w:hAnsi="Times New Roman"/>
+                <w:b w:val="0"/>
+                <w:i w:val="0"/>
+                <w:color w:val="000000"/>
+                <w:sz w:val="19"/>
+              </w:rPr>
+              <w:t>JavaScript Object Notation</w:t>
+            </w:r>
+          </w:p>
+        </w:tc>
+      </w:tr>
+      <w:tr>
+        <w:tc>
+          <w:tcPr>
+            <w:tcW w:type="dxa" w:w="2160"/>
+            <w:tcMar>
+              <w:top w:w="90" w:type="dxa"/>
+              <w:start w:w="110" w:type="dxa"/>
+              <w:bottom w:w="90" w:type="dxa"/>
+              <w:end w:w="110" w:type="dxa"/>
+            </w:tcMar>
+            <w:vAlign w:val="center"/>
+          </w:tcPr>
+          <w:p>
+            <w:pPr>
+              <w:spacing w:line="240" w:lineRule="auto" w:after="0"/>
+              <w:jc w:val="center"/>
+            </w:pPr>
+            <w:r>
+              <w:rPr>
+                <w:rFonts w:ascii="Times New Roman" w:hAnsi="Times New Roman"/>
+                <w:b w:val="0"/>
+                <w:i w:val="0"/>
+                <w:color w:val="000000"/>
+                <w:sz w:val="19"/>
+              </w:rPr>
+              <w:t>JWT</w:t>
+            </w:r>
+          </w:p>
+        </w:tc>
+        <w:tc>
+          <w:tcPr>
+            <w:tcW w:type="dxa" w:w="7056"/>
+            <w:tcMar>
+              <w:top w:w="90" w:type="dxa"/>
+              <w:start w:w="110" w:type="dxa"/>
+              <w:bottom w:w="90" w:type="dxa"/>
+              <w:end w:w="110" w:type="dxa"/>
+            </w:tcMar>
+            <w:vAlign w:val="center"/>
+          </w:tcPr>
+          <w:p>
+            <w:pPr>
+              <w:spacing w:line="240" w:lineRule="auto" w:after="0"/>
+              <w:jc w:val="center"/>
+            </w:pPr>
+            <w:r>
+              <w:rPr>
+                <w:rFonts w:ascii="Times New Roman" w:hAnsi="Times New Roman"/>
+                <w:b w:val="0"/>
+                <w:i w:val="0"/>
+                <w:color w:val="000000"/>
+                <w:sz w:val="19"/>
+              </w:rPr>
+              <w:t>JSON Web Token</w:t>
+            </w:r>
+          </w:p>
+        </w:tc>
+      </w:tr>
+      <w:tr>
+        <w:tc>
+          <w:tcPr>
+            <w:tcW w:type="dxa" w:w="2160"/>
+            <w:tcMar>
+              <w:top w:w="90" w:type="dxa"/>
+              <w:start w:w="110" w:type="dxa"/>
+              <w:bottom w:w="90" w:type="dxa"/>
+              <w:end w:w="110" w:type="dxa"/>
+            </w:tcMar>
+            <w:vAlign w:val="center"/>
+            <w:shd w:fill="F2F6FA"/>
+          </w:tcPr>
+          <w:p>
+            <w:pPr>
+              <w:spacing w:line="240" w:lineRule="auto" w:after="0"/>
+              <w:jc w:val="center"/>
+            </w:pPr>
+            <w:r>
+              <w:rPr>
+                <w:rFonts w:ascii="Times New Roman" w:hAnsi="Times New Roman"/>
+                <w:b w:val="0"/>
+                <w:i w:val="0"/>
+                <w:color w:val="000000"/>
+                <w:sz w:val="19"/>
+              </w:rPr>
+              <w:t>NoSQL</w:t>
+            </w:r>
+          </w:p>
+        </w:tc>
+        <w:tc>
+          <w:tcPr>
+            <w:tcW w:type="dxa" w:w="7056"/>
+            <w:tcMar>
+              <w:top w:w="90" w:type="dxa"/>
+              <w:start w:w="110" w:type="dxa"/>
+              <w:bottom w:w="90" w:type="dxa"/>
+              <w:end w:w="110" w:type="dxa"/>
+            </w:tcMar>
+            <w:vAlign w:val="center"/>
+            <w:shd w:fill="F2F6FA"/>
+          </w:tcPr>
+          <w:p>
+            <w:pPr>
+              <w:spacing w:line="240" w:lineRule="auto" w:after="0"/>
+              <w:jc w:val="left"/>
+            </w:pPr>
+            <w:r>
+              <w:rPr>
+                <w:rFonts w:ascii="Times New Roman" w:hAnsi="Times New Roman"/>
+                <w:b w:val="0"/>
+                <w:i w:val="0"/>
+                <w:color w:val="000000"/>
+                <w:sz w:val="19"/>
+              </w:rPr>
+              <w:t>Non relational database model</w:t>
+            </w:r>
+          </w:p>
+        </w:tc>
+      </w:tr>
+      <w:tr>
+        <w:tc>
+          <w:tcPr>
+            <w:tcW w:type="dxa" w:w="2160"/>
+            <w:tcMar>
+              <w:top w:w="90" w:type="dxa"/>
+              <w:start w:w="110" w:type="dxa"/>
+              <w:bottom w:w="90" w:type="dxa"/>
+              <w:end w:w="110" w:type="dxa"/>
+            </w:tcMar>
+            <w:vAlign w:val="center"/>
+          </w:tcPr>
+          <w:p>
+            <w:pPr>
+              <w:spacing w:line="240" w:lineRule="auto" w:after="0"/>
+              <w:jc w:val="center"/>
+            </w:pPr>
+            <w:r>
+              <w:rPr>
+                <w:rFonts w:ascii="Times New Roman" w:hAnsi="Times New Roman"/>
+                <w:b w:val="0"/>
+                <w:i w:val="0"/>
+                <w:color w:val="000000"/>
+                <w:sz w:val="19"/>
+              </w:rPr>
+              <w:t>SPA</w:t>
+            </w:r>
+          </w:p>
+        </w:tc>
+        <w:tc>
+          <w:tcPr>
+            <w:tcW w:type="dxa" w:w="7056"/>
+            <w:tcMar>
+              <w:top w:w="90" w:type="dxa"/>
+              <w:start w:w="110" w:type="dxa"/>
+              <w:bottom w:w="90" w:type="dxa"/>
+              <w:end w:w="110" w:type="dxa"/>
+            </w:tcMar>
+            <w:vAlign w:val="center"/>
+          </w:tcPr>
+          <w:p>
+            <w:pPr>
+              <w:spacing w:line="240" w:lineRule="auto" w:after="0"/>
+              <w:jc w:val="center"/>
+            </w:pPr>
+            <w:r>
+              <w:rPr>
+                <w:rFonts w:ascii="Times New Roman" w:hAnsi="Times New Roman"/>
+                <w:b w:val="0"/>
+                <w:i w:val="0"/>
+                <w:color w:val="000000"/>
+                <w:sz w:val="19"/>
+              </w:rPr>
+              <w:t>Single Page Application</w:t>
+            </w:r>
+          </w:p>
+        </w:tc>
+      </w:tr>
+      <w:tr>
+        <w:tc>
+          <w:tcPr>
+            <w:tcW w:type="dxa" w:w="2160"/>
+            <w:tcMar>
+              <w:top w:w="90" w:type="dxa"/>
+              <w:start w:w="110" w:type="dxa"/>
+              <w:bottom w:w="90" w:type="dxa"/>
+              <w:end w:w="110" w:type="dxa"/>
+            </w:tcMar>
+            <w:vAlign w:val="center"/>
+            <w:shd w:fill="F2F6FA"/>
+          </w:tcPr>
+          <w:p>
+            <w:pPr>
+              <w:spacing w:line="240" w:lineRule="auto" w:after="0"/>
+              <w:jc w:val="center"/>
+            </w:pPr>
+            <w:r>
+              <w:rPr>
+                <w:rFonts w:ascii="Times New Roman" w:hAnsi="Times New Roman"/>
+                <w:b w:val="0"/>
+                <w:i w:val="0"/>
+                <w:color w:val="000000"/>
+                <w:sz w:val="19"/>
+              </w:rPr>
+              <w:t>UI</w:t>
+            </w:r>
+          </w:p>
+        </w:tc>
+        <w:tc>
+          <w:tcPr>
+            <w:tcW w:type="dxa" w:w="7056"/>
+            <w:tcMar>
+              <w:top w:w="90" w:type="dxa"/>
+              <w:start w:w="110" w:type="dxa"/>
+              <w:bottom w:w="90" w:type="dxa"/>
+              <w:end w:w="110" w:type="dxa"/>
+            </w:tcMar>
+            <w:vAlign w:val="center"/>
+            <w:shd w:fill="F2F6FA"/>
+          </w:tcPr>
+          <w:p>
+            <w:pPr>
+              <w:spacing w:line="240" w:lineRule="auto" w:after="0"/>
+              <w:jc w:val="center"/>
+            </w:pPr>
+            <w:r>
+              <w:rPr>
+                <w:rFonts w:ascii="Times New Roman" w:hAnsi="Times New Roman"/>
+                <w:b w:val="0"/>
+                <w:i w:val="0"/>
+                <w:color w:val="000000"/>
+                <w:sz w:val="19"/>
+              </w:rPr>
+              <w:t>User Interface</w:t>
+            </w:r>
+          </w:p>
+        </w:tc>
+      </w:tr>
+      <w:tr>
+        <w:tc>
+          <w:tcPr>
+            <w:tcW w:type="dxa" w:w="2160"/>
+            <w:tcMar>
+              <w:top w:w="90" w:type="dxa"/>
+              <w:start w:w="110" w:type="dxa"/>
+              <w:bottom w:w="90" w:type="dxa"/>
+              <w:end w:w="110" w:type="dxa"/>
+            </w:tcMar>
+            <w:vAlign w:val="center"/>
+          </w:tcPr>
+          <w:p>
+            <w:pPr>
+              <w:spacing w:line="240" w:lineRule="auto" w:after="0"/>
+              <w:jc w:val="center"/>
+            </w:pPr>
+            <w:r>
+              <w:rPr>
+                <w:rFonts w:ascii="Times New Roman" w:hAnsi="Times New Roman"/>
+                <w:b w:val="0"/>
+                <w:i w:val="0"/>
+                <w:color w:val="000000"/>
+                <w:sz w:val="19"/>
+              </w:rPr>
+              <w:t>UPI</w:t>
+            </w:r>
+          </w:p>
+        </w:tc>
+        <w:tc>
+          <w:tcPr>
+            <w:tcW w:type="dxa" w:w="7056"/>
+            <w:tcMar>
+              <w:top w:w="90" w:type="dxa"/>
+              <w:start w:w="110" w:type="dxa"/>
+              <w:bottom w:w="90" w:type="dxa"/>
+              <w:end w:w="110" w:type="dxa"/>
+            </w:tcMar>
+            <w:vAlign w:val="center"/>
+          </w:tcPr>
+          <w:p>
+            <w:pPr>
+              <w:spacing w:line="240" w:lineRule="auto" w:after="0"/>
+              <w:jc w:val="left"/>
+            </w:pPr>
+            <w:r>
+              <w:rPr>
+                <w:rFonts w:ascii="Times New Roman" w:hAnsi="Times New Roman"/>
+                <w:b w:val="0"/>
+                <w:i w:val="0"/>
+                <w:color w:val="000000"/>
+                <w:sz w:val="19"/>
+              </w:rPr>
+              <w:t>Unified Payments Interface</w:t>
+            </w:r>
+          </w:p>
+        </w:tc>
+      </w:tr>
+      <w:tr>
+        <w:tc>
+          <w:tcPr>
+            <w:tcW w:type="dxa" w:w="2160"/>
+            <w:tcMar>
+              <w:top w:w="90" w:type="dxa"/>
+              <w:start w:w="110" w:type="dxa"/>
+              <w:bottom w:w="90" w:type="dxa"/>
+              <w:end w:w="110" w:type="dxa"/>
+            </w:tcMar>
+            <w:vAlign w:val="center"/>
+            <w:shd w:fill="F2F6FA"/>
+          </w:tcPr>
+          <w:p>
+            <w:pPr>
+              <w:spacing w:line="240" w:lineRule="auto" w:after="0"/>
+              <w:jc w:val="center"/>
+            </w:pPr>
+            <w:r>
+              <w:rPr>
+                <w:rFonts w:ascii="Times New Roman" w:hAnsi="Times New Roman"/>
+                <w:b w:val="0"/>
+                <w:i w:val="0"/>
+                <w:color w:val="000000"/>
+                <w:sz w:val="19"/>
+              </w:rPr>
+              <w:t>UX</w:t>
+            </w:r>
+          </w:p>
+        </w:tc>
+        <w:tc>
+          <w:tcPr>
+            <w:tcW w:type="dxa" w:w="7056"/>
+            <w:tcMar>
+              <w:top w:w="90" w:type="dxa"/>
+              <w:start w:w="110" w:type="dxa"/>
+              <w:bottom w:w="90" w:type="dxa"/>
+              <w:end w:w="110" w:type="dxa"/>
+            </w:tcMar>
+            <w:vAlign w:val="center"/>
+            <w:shd w:fill="F2F6FA"/>
+          </w:tcPr>
+          <w:p>
+            <w:pPr>
+              <w:spacing w:line="240" w:lineRule="auto" w:after="0"/>
+              <w:jc w:val="center"/>
+            </w:pPr>
+            <w:r>
+              <w:rPr>
+                <w:rFonts w:ascii="Times New Roman" w:hAnsi="Times New Roman"/>
+                <w:b w:val="0"/>
+                <w:i w:val="0"/>
+                <w:color w:val="000000"/>
+                <w:sz w:val="19"/>
+              </w:rPr>
+              <w:t>User Experience</w:t>
+            </w:r>
+          </w:p>
+        </w:tc>
+      </w:tr>
+    </w:tbl>
+    <w:p>
+      <w:pPr>
+        <w:spacing w:after="40"/>
+      </w:pPr>
+    </w:p>
+    <w:p>
+      <w:r>
+        <w:br w:type="page"/>
+      </w:r>
+    </w:p>
+    <w:p>
+      <w:pPr>
         <w:spacing w:after="360"/>
         <w:jc w:val="center"/>
       </w:pPr>
@@ -2213,7 +4217,7 @@
           <w:b/>
           <w:i w:val="0"/>
           <w:color w:val="000000"/>
-          <w:sz w:val="32"/>
+          <w:sz w:val="28"/>
         </w:rPr>
         <w:t>ABSTRACT</w:t>
       </w:r>
@@ -2270,9 +4274,9 @@
           <w:b/>
           <w:i w:val="0"/>
           <w:color w:val="000000"/>
-          <w:sz w:val="32"/>
+          <w:sz w:val="28"/>
         </w:rPr>
-        <w:t>TABLE OF CONTENTS</w:t>
+        <w:t>LIST OF CONTENTS</w:t>
       </w:r>
     </w:p>
     <w:p>
@@ -2292,1866 +4296,6 @@
         <w:fldChar w:fldCharType="separate"/>
         <w:fldChar w:fldCharType="end"/>
       </w:r>
-    </w:p>
-    <w:p>
-      <w:r>
-        <w:rPr>
-          <w:rFonts w:ascii="Times New Roman" w:hAnsi="Times New Roman"/>
-          <w:b w:val="0"/>
-          <w:i w:val="0"/>
-          <w:color w:val="000000"/>
-          <w:sz w:val="24"/>
-        </w:rPr>
-        <w:t>Note: In Microsoft Word, select the table and choose Update Field if page numbers do not refresh automatically.</w:t>
-      </w:r>
-    </w:p>
-    <w:p>
-      <w:r>
-        <w:br w:type="page"/>
-      </w:r>
-    </w:p>
-    <w:p>
-      <w:pPr>
-        <w:spacing w:after="240"/>
-        <w:jc w:val="center"/>
-      </w:pPr>
-      <w:r>
-        <w:rPr>
-          <w:rFonts w:ascii="Times New Roman" w:hAnsi="Times New Roman"/>
-          <w:b/>
-          <w:i w:val="0"/>
-          <w:color w:val="000000"/>
-          <w:sz w:val="32"/>
-        </w:rPr>
-        <w:t>LIST OF FIGURES</w:t>
-      </w:r>
-    </w:p>
-    <w:tbl>
-      <w:tblPr>
-        <w:tblW w:type="auto" w:w="0"/>
-        <w:jc w:val="center"/>
-        <w:tblLayout w:type="fixed"/>
-        <w:tblLook w:firstColumn="1" w:firstRow="1" w:lastColumn="0" w:lastRow="0" w:noHBand="0" w:noVBand="1" w:val="04A0"/>
-        <w:tblBorders>
-          <w:top w:val="single" w:sz="6" w:color="D9D9D9"/>
-          <w:left w:val="single" w:sz="6" w:color="D9D9D9"/>
-          <w:bottom w:val="single" w:sz="6" w:color="D9D9D9"/>
-          <w:right w:val="single" w:sz="6" w:color="D9D9D9"/>
-          <w:insideH w:val="single" w:sz="6" w:color="D9D9D9"/>
-          <w:insideV w:val="single" w:sz="6" w:color="D9D9D9"/>
-        </w:tblBorders>
-      </w:tblPr>
-      <w:tblGrid>
-        <w:gridCol w:w="4262"/>
-        <w:gridCol w:w="4262"/>
-      </w:tblGrid>
-      <w:tr>
-        <w:trPr>
-          <w:tblHeader w:val="true"/>
-        </w:trPr>
-        <w:tc>
-          <w:tcPr>
-            <w:tcW w:type="dxa" w:w="1584"/>
-            <w:shd w:fill="1F4E78"/>
-            <w:tcMar>
-              <w:top w:w="90" w:type="dxa"/>
-              <w:start w:w="110" w:type="dxa"/>
-              <w:bottom w:w="90" w:type="dxa"/>
-              <w:end w:w="110" w:type="dxa"/>
-            </w:tcMar>
-            <w:vAlign w:val="center"/>
-          </w:tcPr>
-          <w:p>
-            <w:pPr>
-              <w:jc w:val="center"/>
-            </w:pPr>
-            <w:r>
-              <w:rPr>
-                <w:rFonts w:ascii="Times New Roman" w:hAnsi="Times New Roman"/>
-                <w:b/>
-                <w:i w:val="0"/>
-                <w:color w:val="FFFFFF"/>
-                <w:sz w:val="20"/>
-              </w:rPr>
-              <w:t>Figure</w:t>
-            </w:r>
-          </w:p>
-        </w:tc>
-        <w:tc>
-          <w:tcPr>
-            <w:tcW w:type="dxa" w:w="7632"/>
-            <w:shd w:fill="1F4E78"/>
-            <w:tcMar>
-              <w:top w:w="90" w:type="dxa"/>
-              <w:start w:w="110" w:type="dxa"/>
-              <w:bottom w:w="90" w:type="dxa"/>
-              <w:end w:w="110" w:type="dxa"/>
-            </w:tcMar>
-            <w:vAlign w:val="center"/>
-          </w:tcPr>
-          <w:p>
-            <w:pPr>
-              <w:jc w:val="center"/>
-            </w:pPr>
-            <w:r>
-              <w:rPr>
-                <w:rFonts w:ascii="Times New Roman" w:hAnsi="Times New Roman"/>
-                <w:b/>
-                <w:i w:val="0"/>
-                <w:color w:val="FFFFFF"/>
-                <w:sz w:val="20"/>
-              </w:rPr>
-              <w:t>Title</w:t>
-            </w:r>
-          </w:p>
-        </w:tc>
-      </w:tr>
-      <w:tr>
-        <w:tc>
-          <w:tcPr>
-            <w:tcW w:type="dxa" w:w="1584"/>
-            <w:tcMar>
-              <w:top w:w="90" w:type="dxa"/>
-              <w:start w:w="110" w:type="dxa"/>
-              <w:bottom w:w="90" w:type="dxa"/>
-              <w:end w:w="110" w:type="dxa"/>
-            </w:tcMar>
-            <w:vAlign w:val="center"/>
-          </w:tcPr>
-          <w:p>
-            <w:pPr>
-              <w:spacing w:line="240" w:lineRule="auto" w:after="0"/>
-              <w:jc w:val="center"/>
-            </w:pPr>
-            <w:r>
-              <w:rPr>
-                <w:rFonts w:ascii="Times New Roman" w:hAnsi="Times New Roman"/>
-                <w:b w:val="0"/>
-                <w:i w:val="0"/>
-                <w:color w:val="000000"/>
-                <w:sz w:val="19"/>
-              </w:rPr>
-              <w:t>4.1</w:t>
-            </w:r>
-          </w:p>
-        </w:tc>
-        <w:tc>
-          <w:tcPr>
-            <w:tcW w:type="dxa" w:w="7632"/>
-            <w:tcMar>
-              <w:top w:w="90" w:type="dxa"/>
-              <w:start w:w="110" w:type="dxa"/>
-              <w:bottom w:w="90" w:type="dxa"/>
-              <w:end w:w="110" w:type="dxa"/>
-            </w:tcMar>
-            <w:vAlign w:val="center"/>
-          </w:tcPr>
-          <w:p>
-            <w:pPr>
-              <w:spacing w:line="240" w:lineRule="auto" w:after="0"/>
-              <w:jc w:val="left"/>
-            </w:pPr>
-            <w:r>
-              <w:rPr>
-                <w:rFonts w:ascii="Times New Roman" w:hAnsi="Times New Roman"/>
-                <w:b w:val="0"/>
-                <w:i w:val="0"/>
-                <w:color w:val="000000"/>
-                <w:sz w:val="19"/>
-              </w:rPr>
-              <w:t>Logical architecture of Stashflow</w:t>
-            </w:r>
-          </w:p>
-        </w:tc>
-      </w:tr>
-      <w:tr>
-        <w:tc>
-          <w:tcPr>
-            <w:tcW w:type="dxa" w:w="1584"/>
-            <w:tcMar>
-              <w:top w:w="90" w:type="dxa"/>
-              <w:start w:w="110" w:type="dxa"/>
-              <w:bottom w:w="90" w:type="dxa"/>
-              <w:end w:w="110" w:type="dxa"/>
-            </w:tcMar>
-            <w:vAlign w:val="center"/>
-            <w:shd w:fill="F2F6FA"/>
-          </w:tcPr>
-          <w:p>
-            <w:pPr>
-              <w:spacing w:line="240" w:lineRule="auto" w:after="0"/>
-              <w:jc w:val="center"/>
-            </w:pPr>
-            <w:r>
-              <w:rPr>
-                <w:rFonts w:ascii="Times New Roman" w:hAnsi="Times New Roman"/>
-                <w:b w:val="0"/>
-                <w:i w:val="0"/>
-                <w:color w:val="000000"/>
-                <w:sz w:val="19"/>
-              </w:rPr>
-              <w:t>4.2</w:t>
-            </w:r>
-          </w:p>
-        </w:tc>
-        <w:tc>
-          <w:tcPr>
-            <w:tcW w:type="dxa" w:w="7632"/>
-            <w:tcMar>
-              <w:top w:w="90" w:type="dxa"/>
-              <w:start w:w="110" w:type="dxa"/>
-              <w:bottom w:w="90" w:type="dxa"/>
-              <w:end w:w="110" w:type="dxa"/>
-            </w:tcMar>
-            <w:vAlign w:val="center"/>
-            <w:shd w:fill="F2F6FA"/>
-          </w:tcPr>
-          <w:p>
-            <w:pPr>
-              <w:spacing w:line="240" w:lineRule="auto" w:after="0"/>
-              <w:jc w:val="left"/>
-            </w:pPr>
-            <w:r>
-              <w:rPr>
-                <w:rFonts w:ascii="Times New Roman" w:hAnsi="Times New Roman"/>
-                <w:b w:val="0"/>
-                <w:i w:val="0"/>
-                <w:color w:val="000000"/>
-                <w:sz w:val="19"/>
-              </w:rPr>
-              <w:t>Authentication request flow</w:t>
-            </w:r>
-          </w:p>
-        </w:tc>
-      </w:tr>
-      <w:tr>
-        <w:tc>
-          <w:tcPr>
-            <w:tcW w:type="dxa" w:w="1584"/>
-            <w:tcMar>
-              <w:top w:w="90" w:type="dxa"/>
-              <w:start w:w="110" w:type="dxa"/>
-              <w:bottom w:w="90" w:type="dxa"/>
-              <w:end w:w="110" w:type="dxa"/>
-            </w:tcMar>
-            <w:vAlign w:val="center"/>
-          </w:tcPr>
-          <w:p>
-            <w:pPr>
-              <w:spacing w:line="240" w:lineRule="auto" w:after="0"/>
-              <w:jc w:val="center"/>
-            </w:pPr>
-            <w:r>
-              <w:rPr>
-                <w:rFonts w:ascii="Times New Roman" w:hAnsi="Times New Roman"/>
-                <w:b w:val="0"/>
-                <w:i w:val="0"/>
-                <w:color w:val="000000"/>
-                <w:sz w:val="19"/>
-              </w:rPr>
-              <w:t>4.3</w:t>
-            </w:r>
-          </w:p>
-        </w:tc>
-        <w:tc>
-          <w:tcPr>
-            <w:tcW w:type="dxa" w:w="7632"/>
-            <w:tcMar>
-              <w:top w:w="90" w:type="dxa"/>
-              <w:start w:w="110" w:type="dxa"/>
-              <w:bottom w:w="90" w:type="dxa"/>
-              <w:end w:w="110" w:type="dxa"/>
-            </w:tcMar>
-            <w:vAlign w:val="center"/>
-          </w:tcPr>
-          <w:p>
-            <w:pPr>
-              <w:spacing w:line="240" w:lineRule="auto" w:after="0"/>
-              <w:jc w:val="left"/>
-            </w:pPr>
-            <w:r>
-              <w:rPr>
-                <w:rFonts w:ascii="Times New Roman" w:hAnsi="Times New Roman"/>
-                <w:b w:val="0"/>
-                <w:i w:val="0"/>
-                <w:color w:val="000000"/>
-                <w:sz w:val="19"/>
-              </w:rPr>
-              <w:t>Razorpay test payment sequence</w:t>
-            </w:r>
-          </w:p>
-        </w:tc>
-      </w:tr>
-      <w:tr>
-        <w:tc>
-          <w:tcPr>
-            <w:tcW w:type="dxa" w:w="1584"/>
-            <w:tcMar>
-              <w:top w:w="90" w:type="dxa"/>
-              <w:start w:w="110" w:type="dxa"/>
-              <w:bottom w:w="90" w:type="dxa"/>
-              <w:end w:w="110" w:type="dxa"/>
-            </w:tcMar>
-            <w:vAlign w:val="center"/>
-            <w:shd w:fill="F2F6FA"/>
-          </w:tcPr>
-          <w:p>
-            <w:pPr>
-              <w:spacing w:line="240" w:lineRule="auto" w:after="0"/>
-              <w:jc w:val="center"/>
-            </w:pPr>
-            <w:r>
-              <w:rPr>
-                <w:rFonts w:ascii="Times New Roman" w:hAnsi="Times New Roman"/>
-                <w:b w:val="0"/>
-                <w:i w:val="0"/>
-                <w:color w:val="000000"/>
-                <w:sz w:val="19"/>
-              </w:rPr>
-              <w:t>5.1</w:t>
-            </w:r>
-          </w:p>
-        </w:tc>
-        <w:tc>
-          <w:tcPr>
-            <w:tcW w:type="dxa" w:w="7632"/>
-            <w:tcMar>
-              <w:top w:w="90" w:type="dxa"/>
-              <w:start w:w="110" w:type="dxa"/>
-              <w:bottom w:w="90" w:type="dxa"/>
-              <w:end w:w="110" w:type="dxa"/>
-            </w:tcMar>
-            <w:vAlign w:val="center"/>
-            <w:shd w:fill="F2F6FA"/>
-          </w:tcPr>
-          <w:p>
-            <w:pPr>
-              <w:spacing w:line="240" w:lineRule="auto" w:after="0"/>
-              <w:jc w:val="left"/>
-            </w:pPr>
-            <w:r>
-              <w:rPr>
-                <w:rFonts w:ascii="Times New Roman" w:hAnsi="Times New Roman"/>
-                <w:b w:val="0"/>
-                <w:i w:val="0"/>
-                <w:color w:val="000000"/>
-                <w:sz w:val="19"/>
-              </w:rPr>
-              <w:t>Dashboard navigation structure</w:t>
-            </w:r>
-          </w:p>
-        </w:tc>
-      </w:tr>
-      <w:tr>
-        <w:tc>
-          <w:tcPr>
-            <w:tcW w:type="dxa" w:w="1584"/>
-            <w:tcMar>
-              <w:top w:w="90" w:type="dxa"/>
-              <w:start w:w="110" w:type="dxa"/>
-              <w:bottom w:w="90" w:type="dxa"/>
-              <w:end w:w="110" w:type="dxa"/>
-            </w:tcMar>
-            <w:vAlign w:val="center"/>
-          </w:tcPr>
-          <w:p>
-            <w:pPr>
-              <w:spacing w:line="240" w:lineRule="auto" w:after="0"/>
-              <w:jc w:val="center"/>
-            </w:pPr>
-            <w:r>
-              <w:rPr>
-                <w:rFonts w:ascii="Times New Roman" w:hAnsi="Times New Roman"/>
-                <w:b w:val="0"/>
-                <w:i w:val="0"/>
-                <w:color w:val="000000"/>
-                <w:sz w:val="19"/>
-              </w:rPr>
-              <w:t>5.2</w:t>
-            </w:r>
-          </w:p>
-        </w:tc>
-        <w:tc>
-          <w:tcPr>
-            <w:tcW w:type="dxa" w:w="7632"/>
-            <w:tcMar>
-              <w:top w:w="90" w:type="dxa"/>
-              <w:start w:w="110" w:type="dxa"/>
-              <w:bottom w:w="90" w:type="dxa"/>
-              <w:end w:w="110" w:type="dxa"/>
-            </w:tcMar>
-            <w:vAlign w:val="center"/>
-          </w:tcPr>
-          <w:p>
-            <w:pPr>
-              <w:spacing w:line="240" w:lineRule="auto" w:after="0"/>
-              <w:jc w:val="left"/>
-            </w:pPr>
-            <w:r>
-              <w:rPr>
-                <w:rFonts w:ascii="Times New Roman" w:hAnsi="Times New Roman"/>
-                <w:b w:val="0"/>
-                <w:i w:val="0"/>
-                <w:color w:val="000000"/>
-                <w:sz w:val="19"/>
-              </w:rPr>
-              <w:t>Fund transaction state transition</w:t>
-            </w:r>
-          </w:p>
-        </w:tc>
-      </w:tr>
-    </w:tbl>
-    <w:p>
-      <w:pPr>
-        <w:spacing w:after="40"/>
-      </w:pPr>
-    </w:p>
-    <w:p>
-      <w:pPr>
-        <w:spacing w:after="240"/>
-        <w:jc w:val="center"/>
-      </w:pPr>
-      <w:r>
-        <w:rPr>
-          <w:rFonts w:ascii="Times New Roman" w:hAnsi="Times New Roman"/>
-          <w:b/>
-          <w:i w:val="0"/>
-          <w:color w:val="000000"/>
-          <w:sz w:val="32"/>
-        </w:rPr>
-        <w:t>LIST OF TABLES</w:t>
-      </w:r>
-    </w:p>
-    <w:tbl>
-      <w:tblPr>
-        <w:tblW w:type="auto" w:w="0"/>
-        <w:jc w:val="center"/>
-        <w:tblLayout w:type="fixed"/>
-        <w:tblLook w:firstColumn="1" w:firstRow="1" w:lastColumn="0" w:lastRow="0" w:noHBand="0" w:noVBand="1" w:val="04A0"/>
-        <w:tblBorders>
-          <w:top w:val="single" w:sz="6" w:color="D9D9D9"/>
-          <w:left w:val="single" w:sz="6" w:color="D9D9D9"/>
-          <w:bottom w:val="single" w:sz="6" w:color="D9D9D9"/>
-          <w:right w:val="single" w:sz="6" w:color="D9D9D9"/>
-          <w:insideH w:val="single" w:sz="6" w:color="D9D9D9"/>
-          <w:insideV w:val="single" w:sz="6" w:color="D9D9D9"/>
-        </w:tblBorders>
-      </w:tblPr>
-      <w:tblGrid>
-        <w:gridCol w:w="4262"/>
-        <w:gridCol w:w="4262"/>
-      </w:tblGrid>
-      <w:tr>
-        <w:trPr>
-          <w:tblHeader w:val="true"/>
-        </w:trPr>
-        <w:tc>
-          <w:tcPr>
-            <w:tcW w:type="dxa" w:w="1584"/>
-            <w:shd w:fill="1F4E78"/>
-            <w:tcMar>
-              <w:top w:w="90" w:type="dxa"/>
-              <w:start w:w="110" w:type="dxa"/>
-              <w:bottom w:w="90" w:type="dxa"/>
-              <w:end w:w="110" w:type="dxa"/>
-            </w:tcMar>
-            <w:vAlign w:val="center"/>
-          </w:tcPr>
-          <w:p>
-            <w:pPr>
-              <w:jc w:val="center"/>
-            </w:pPr>
-            <w:r>
-              <w:rPr>
-                <w:rFonts w:ascii="Times New Roman" w:hAnsi="Times New Roman"/>
-                <w:b/>
-                <w:i w:val="0"/>
-                <w:color w:val="FFFFFF"/>
-                <w:sz w:val="20"/>
-              </w:rPr>
-              <w:t>Table</w:t>
-            </w:r>
-          </w:p>
-        </w:tc>
-        <w:tc>
-          <w:tcPr>
-            <w:tcW w:type="dxa" w:w="7632"/>
-            <w:shd w:fill="1F4E78"/>
-            <w:tcMar>
-              <w:top w:w="90" w:type="dxa"/>
-              <w:start w:w="110" w:type="dxa"/>
-              <w:bottom w:w="90" w:type="dxa"/>
-              <w:end w:w="110" w:type="dxa"/>
-            </w:tcMar>
-            <w:vAlign w:val="center"/>
-          </w:tcPr>
-          <w:p>
-            <w:pPr>
-              <w:jc w:val="center"/>
-            </w:pPr>
-            <w:r>
-              <w:rPr>
-                <w:rFonts w:ascii="Times New Roman" w:hAnsi="Times New Roman"/>
-                <w:b/>
-                <w:i w:val="0"/>
-                <w:color w:val="FFFFFF"/>
-                <w:sz w:val="20"/>
-              </w:rPr>
-              <w:t>Title</w:t>
-            </w:r>
-          </w:p>
-        </w:tc>
-      </w:tr>
-      <w:tr>
-        <w:tc>
-          <w:tcPr>
-            <w:tcW w:type="dxa" w:w="1584"/>
-            <w:tcMar>
-              <w:top w:w="90" w:type="dxa"/>
-              <w:start w:w="110" w:type="dxa"/>
-              <w:bottom w:w="90" w:type="dxa"/>
-              <w:end w:w="110" w:type="dxa"/>
-            </w:tcMar>
-            <w:vAlign w:val="center"/>
-          </w:tcPr>
-          <w:p>
-            <w:pPr>
-              <w:spacing w:line="240" w:lineRule="auto" w:after="0"/>
-              <w:jc w:val="center"/>
-            </w:pPr>
-            <w:r>
-              <w:rPr>
-                <w:rFonts w:ascii="Times New Roman" w:hAnsi="Times New Roman"/>
-                <w:b w:val="0"/>
-                <w:i w:val="0"/>
-                <w:color w:val="000000"/>
-                <w:sz w:val="19"/>
-              </w:rPr>
-              <w:t>2.1</w:t>
-            </w:r>
-          </w:p>
-        </w:tc>
-        <w:tc>
-          <w:tcPr>
-            <w:tcW w:type="dxa" w:w="7632"/>
-            <w:tcMar>
-              <w:top w:w="90" w:type="dxa"/>
-              <w:start w:w="110" w:type="dxa"/>
-              <w:bottom w:w="90" w:type="dxa"/>
-              <w:end w:w="110" w:type="dxa"/>
-            </w:tcMar>
-            <w:vAlign w:val="center"/>
-          </w:tcPr>
-          <w:p>
-            <w:pPr>
-              <w:spacing w:line="240" w:lineRule="auto" w:after="0"/>
-              <w:jc w:val="left"/>
-            </w:pPr>
-            <w:r>
-              <w:rPr>
-                <w:rFonts w:ascii="Times New Roman" w:hAnsi="Times New Roman"/>
-                <w:b w:val="0"/>
-                <w:i w:val="0"/>
-                <w:color w:val="000000"/>
-                <w:sz w:val="19"/>
-              </w:rPr>
-              <w:t>Comparison of the existing and proposed approaches</w:t>
-            </w:r>
-          </w:p>
-        </w:tc>
-      </w:tr>
-      <w:tr>
-        <w:tc>
-          <w:tcPr>
-            <w:tcW w:type="dxa" w:w="1584"/>
-            <w:tcMar>
-              <w:top w:w="90" w:type="dxa"/>
-              <w:start w:w="110" w:type="dxa"/>
-              <w:bottom w:w="90" w:type="dxa"/>
-              <w:end w:w="110" w:type="dxa"/>
-            </w:tcMar>
-            <w:vAlign w:val="center"/>
-            <w:shd w:fill="F2F6FA"/>
-          </w:tcPr>
-          <w:p>
-            <w:pPr>
-              <w:spacing w:line="240" w:lineRule="auto" w:after="0"/>
-              <w:jc w:val="center"/>
-            </w:pPr>
-            <w:r>
-              <w:rPr>
-                <w:rFonts w:ascii="Times New Roman" w:hAnsi="Times New Roman"/>
-                <w:b w:val="0"/>
-                <w:i w:val="0"/>
-                <w:color w:val="000000"/>
-                <w:sz w:val="19"/>
-              </w:rPr>
-              <w:t>3.1</w:t>
-            </w:r>
-          </w:p>
-        </w:tc>
-        <w:tc>
-          <w:tcPr>
-            <w:tcW w:type="dxa" w:w="7632"/>
-            <w:tcMar>
-              <w:top w:w="90" w:type="dxa"/>
-              <w:start w:w="110" w:type="dxa"/>
-              <w:bottom w:w="90" w:type="dxa"/>
-              <w:end w:w="110" w:type="dxa"/>
-            </w:tcMar>
-            <w:vAlign w:val="center"/>
-            <w:shd w:fill="F2F6FA"/>
-          </w:tcPr>
-          <w:p>
-            <w:pPr>
-              <w:spacing w:line="240" w:lineRule="auto" w:after="0"/>
-              <w:jc w:val="center"/>
-            </w:pPr>
-            <w:r>
-              <w:rPr>
-                <w:rFonts w:ascii="Times New Roman" w:hAnsi="Times New Roman"/>
-                <w:b w:val="0"/>
-                <w:i w:val="0"/>
-                <w:color w:val="000000"/>
-                <w:sz w:val="19"/>
-              </w:rPr>
-              <w:t>Functional requirements</w:t>
-            </w:r>
-          </w:p>
-        </w:tc>
-      </w:tr>
-      <w:tr>
-        <w:tc>
-          <w:tcPr>
-            <w:tcW w:type="dxa" w:w="1584"/>
-            <w:tcMar>
-              <w:top w:w="90" w:type="dxa"/>
-              <w:start w:w="110" w:type="dxa"/>
-              <w:bottom w:w="90" w:type="dxa"/>
-              <w:end w:w="110" w:type="dxa"/>
-            </w:tcMar>
-            <w:vAlign w:val="center"/>
-          </w:tcPr>
-          <w:p>
-            <w:pPr>
-              <w:spacing w:line="240" w:lineRule="auto" w:after="0"/>
-              <w:jc w:val="center"/>
-            </w:pPr>
-            <w:r>
-              <w:rPr>
-                <w:rFonts w:ascii="Times New Roman" w:hAnsi="Times New Roman"/>
-                <w:b w:val="0"/>
-                <w:i w:val="0"/>
-                <w:color w:val="000000"/>
-                <w:sz w:val="19"/>
-              </w:rPr>
-              <w:t>3.2</w:t>
-            </w:r>
-          </w:p>
-        </w:tc>
-        <w:tc>
-          <w:tcPr>
-            <w:tcW w:type="dxa" w:w="7632"/>
-            <w:tcMar>
-              <w:top w:w="90" w:type="dxa"/>
-              <w:start w:w="110" w:type="dxa"/>
-              <w:bottom w:w="90" w:type="dxa"/>
-              <w:end w:w="110" w:type="dxa"/>
-            </w:tcMar>
-            <w:vAlign w:val="center"/>
-          </w:tcPr>
-          <w:p>
-            <w:pPr>
-              <w:spacing w:line="240" w:lineRule="auto" w:after="0"/>
-              <w:jc w:val="left"/>
-            </w:pPr>
-            <w:r>
-              <w:rPr>
-                <w:rFonts w:ascii="Times New Roman" w:hAnsi="Times New Roman"/>
-                <w:b w:val="0"/>
-                <w:i w:val="0"/>
-                <w:color w:val="000000"/>
-                <w:sz w:val="19"/>
-              </w:rPr>
-              <w:t>Non-functional requirements</w:t>
-            </w:r>
-          </w:p>
-        </w:tc>
-      </w:tr>
-      <w:tr>
-        <w:tc>
-          <w:tcPr>
-            <w:tcW w:type="dxa" w:w="1584"/>
-            <w:tcMar>
-              <w:top w:w="90" w:type="dxa"/>
-              <w:start w:w="110" w:type="dxa"/>
-              <w:bottom w:w="90" w:type="dxa"/>
-              <w:end w:w="110" w:type="dxa"/>
-            </w:tcMar>
-            <w:vAlign w:val="center"/>
-            <w:shd w:fill="F2F6FA"/>
-          </w:tcPr>
-          <w:p>
-            <w:pPr>
-              <w:spacing w:line="240" w:lineRule="auto" w:after="0"/>
-              <w:jc w:val="center"/>
-            </w:pPr>
-            <w:r>
-              <w:rPr>
-                <w:rFonts w:ascii="Times New Roman" w:hAnsi="Times New Roman"/>
-                <w:b w:val="0"/>
-                <w:i w:val="0"/>
-                <w:color w:val="000000"/>
-                <w:sz w:val="19"/>
-              </w:rPr>
-              <w:t>3.3</w:t>
-            </w:r>
-          </w:p>
-        </w:tc>
-        <w:tc>
-          <w:tcPr>
-            <w:tcW w:type="dxa" w:w="7632"/>
-            <w:tcMar>
-              <w:top w:w="90" w:type="dxa"/>
-              <w:start w:w="110" w:type="dxa"/>
-              <w:bottom w:w="90" w:type="dxa"/>
-              <w:end w:w="110" w:type="dxa"/>
-            </w:tcMar>
-            <w:vAlign w:val="center"/>
-            <w:shd w:fill="F2F6FA"/>
-          </w:tcPr>
-          <w:p>
-            <w:pPr>
-              <w:spacing w:line="240" w:lineRule="auto" w:after="0"/>
-              <w:jc w:val="left"/>
-            </w:pPr>
-            <w:r>
-              <w:rPr>
-                <w:rFonts w:ascii="Times New Roman" w:hAnsi="Times New Roman"/>
-                <w:b w:val="0"/>
-                <w:i w:val="0"/>
-                <w:color w:val="000000"/>
-                <w:sz w:val="19"/>
-              </w:rPr>
-              <w:t>Hardware and software requirements</w:t>
-            </w:r>
-          </w:p>
-        </w:tc>
-      </w:tr>
-      <w:tr>
-        <w:tc>
-          <w:tcPr>
-            <w:tcW w:type="dxa" w:w="1584"/>
-            <w:tcMar>
-              <w:top w:w="90" w:type="dxa"/>
-              <w:start w:w="110" w:type="dxa"/>
-              <w:bottom w:w="90" w:type="dxa"/>
-              <w:end w:w="110" w:type="dxa"/>
-            </w:tcMar>
-            <w:vAlign w:val="center"/>
-          </w:tcPr>
-          <w:p>
-            <w:pPr>
-              <w:spacing w:line="240" w:lineRule="auto" w:after="0"/>
-              <w:jc w:val="center"/>
-            </w:pPr>
-            <w:r>
-              <w:rPr>
-                <w:rFonts w:ascii="Times New Roman" w:hAnsi="Times New Roman"/>
-                <w:b w:val="0"/>
-                <w:i w:val="0"/>
-                <w:color w:val="000000"/>
-                <w:sz w:val="19"/>
-              </w:rPr>
-              <w:t>4.1</w:t>
-            </w:r>
-          </w:p>
-        </w:tc>
-        <w:tc>
-          <w:tcPr>
-            <w:tcW w:type="dxa" w:w="7632"/>
-            <w:tcMar>
-              <w:top w:w="90" w:type="dxa"/>
-              <w:start w:w="110" w:type="dxa"/>
-              <w:bottom w:w="90" w:type="dxa"/>
-              <w:end w:w="110" w:type="dxa"/>
-            </w:tcMar>
-            <w:vAlign w:val="center"/>
-          </w:tcPr>
-          <w:p>
-            <w:pPr>
-              <w:spacing w:line="240" w:lineRule="auto" w:after="0"/>
-              <w:jc w:val="center"/>
-            </w:pPr>
-            <w:r>
-              <w:rPr>
-                <w:rFonts w:ascii="Times New Roman" w:hAnsi="Times New Roman"/>
-                <w:b w:val="0"/>
-                <w:i w:val="0"/>
-                <w:color w:val="000000"/>
-                <w:sz w:val="19"/>
-              </w:rPr>
-              <w:t>Primary data entities</w:t>
-            </w:r>
-          </w:p>
-        </w:tc>
-      </w:tr>
-      <w:tr>
-        <w:tc>
-          <w:tcPr>
-            <w:tcW w:type="dxa" w:w="1584"/>
-            <w:tcMar>
-              <w:top w:w="90" w:type="dxa"/>
-              <w:start w:w="110" w:type="dxa"/>
-              <w:bottom w:w="90" w:type="dxa"/>
-              <w:end w:w="110" w:type="dxa"/>
-            </w:tcMar>
-            <w:vAlign w:val="center"/>
-            <w:shd w:fill="F2F6FA"/>
-          </w:tcPr>
-          <w:p>
-            <w:pPr>
-              <w:spacing w:line="240" w:lineRule="auto" w:after="0"/>
-              <w:jc w:val="center"/>
-            </w:pPr>
-            <w:r>
-              <w:rPr>
-                <w:rFonts w:ascii="Times New Roman" w:hAnsi="Times New Roman"/>
-                <w:b w:val="0"/>
-                <w:i w:val="0"/>
-                <w:color w:val="000000"/>
-                <w:sz w:val="19"/>
-              </w:rPr>
-              <w:t>5.1</w:t>
-            </w:r>
-          </w:p>
-        </w:tc>
-        <w:tc>
-          <w:tcPr>
-            <w:tcW w:type="dxa" w:w="7632"/>
-            <w:tcMar>
-              <w:top w:w="90" w:type="dxa"/>
-              <w:start w:w="110" w:type="dxa"/>
-              <w:bottom w:w="90" w:type="dxa"/>
-              <w:end w:w="110" w:type="dxa"/>
-            </w:tcMar>
-            <w:vAlign w:val="center"/>
-            <w:shd w:fill="F2F6FA"/>
-          </w:tcPr>
-          <w:p>
-            <w:pPr>
-              <w:spacing w:line="240" w:lineRule="auto" w:after="0"/>
-              <w:jc w:val="center"/>
-            </w:pPr>
-            <w:r>
-              <w:rPr>
-                <w:rFonts w:ascii="Times New Roman" w:hAnsi="Times New Roman"/>
-                <w:b w:val="0"/>
-                <w:i w:val="0"/>
-                <w:color w:val="000000"/>
-                <w:sz w:val="19"/>
-              </w:rPr>
-              <w:t>Main application modules</w:t>
-            </w:r>
-          </w:p>
-        </w:tc>
-      </w:tr>
-      <w:tr>
-        <w:tc>
-          <w:tcPr>
-            <w:tcW w:type="dxa" w:w="1584"/>
-            <w:tcMar>
-              <w:top w:w="90" w:type="dxa"/>
-              <w:start w:w="110" w:type="dxa"/>
-              <w:bottom w:w="90" w:type="dxa"/>
-              <w:end w:w="110" w:type="dxa"/>
-            </w:tcMar>
-            <w:vAlign w:val="center"/>
-          </w:tcPr>
-          <w:p>
-            <w:pPr>
-              <w:spacing w:line="240" w:lineRule="auto" w:after="0"/>
-              <w:jc w:val="center"/>
-            </w:pPr>
-            <w:r>
-              <w:rPr>
-                <w:rFonts w:ascii="Times New Roman" w:hAnsi="Times New Roman"/>
-                <w:b w:val="0"/>
-                <w:i w:val="0"/>
-                <w:color w:val="000000"/>
-                <w:sz w:val="19"/>
-              </w:rPr>
-              <w:t>6.1</w:t>
-            </w:r>
-          </w:p>
-        </w:tc>
-        <w:tc>
-          <w:tcPr>
-            <w:tcW w:type="dxa" w:w="7632"/>
-            <w:tcMar>
-              <w:top w:w="90" w:type="dxa"/>
-              <w:start w:w="110" w:type="dxa"/>
-              <w:bottom w:w="90" w:type="dxa"/>
-              <w:end w:w="110" w:type="dxa"/>
-            </w:tcMar>
-            <w:vAlign w:val="center"/>
-          </w:tcPr>
-          <w:p>
-            <w:pPr>
-              <w:spacing w:line="240" w:lineRule="auto" w:after="0"/>
-              <w:jc w:val="center"/>
-            </w:pPr>
-            <w:r>
-              <w:rPr>
-                <w:rFonts w:ascii="Times New Roman" w:hAnsi="Times New Roman"/>
-                <w:b w:val="0"/>
-                <w:i w:val="0"/>
-                <w:color w:val="000000"/>
-                <w:sz w:val="19"/>
-              </w:rPr>
-              <w:t>Functional test cases</w:t>
-            </w:r>
-          </w:p>
-        </w:tc>
-      </w:tr>
-      <w:tr>
-        <w:tc>
-          <w:tcPr>
-            <w:tcW w:type="dxa" w:w="1584"/>
-            <w:tcMar>
-              <w:top w:w="90" w:type="dxa"/>
-              <w:start w:w="110" w:type="dxa"/>
-              <w:bottom w:w="90" w:type="dxa"/>
-              <w:end w:w="110" w:type="dxa"/>
-            </w:tcMar>
-            <w:vAlign w:val="center"/>
-            <w:shd w:fill="F2F6FA"/>
-          </w:tcPr>
-          <w:p>
-            <w:pPr>
-              <w:spacing w:line="240" w:lineRule="auto" w:after="0"/>
-              <w:jc w:val="center"/>
-            </w:pPr>
-            <w:r>
-              <w:rPr>
-                <w:rFonts w:ascii="Times New Roman" w:hAnsi="Times New Roman"/>
-                <w:b w:val="0"/>
-                <w:i w:val="0"/>
-                <w:color w:val="000000"/>
-                <w:sz w:val="19"/>
-              </w:rPr>
-              <w:t>6.2</w:t>
-            </w:r>
-          </w:p>
-        </w:tc>
-        <w:tc>
-          <w:tcPr>
-            <w:tcW w:type="dxa" w:w="7632"/>
-            <w:tcMar>
-              <w:top w:w="90" w:type="dxa"/>
-              <w:start w:w="110" w:type="dxa"/>
-              <w:bottom w:w="90" w:type="dxa"/>
-              <w:end w:w="110" w:type="dxa"/>
-            </w:tcMar>
-            <w:vAlign w:val="center"/>
-            <w:shd w:fill="F2F6FA"/>
-          </w:tcPr>
-          <w:p>
-            <w:pPr>
-              <w:spacing w:line="240" w:lineRule="auto" w:after="0"/>
-              <w:jc w:val="left"/>
-            </w:pPr>
-            <w:r>
-              <w:rPr>
-                <w:rFonts w:ascii="Times New Roman" w:hAnsi="Times New Roman"/>
-                <w:b w:val="0"/>
-                <w:i w:val="0"/>
-                <w:color w:val="000000"/>
-                <w:sz w:val="19"/>
-              </w:rPr>
-              <w:t>Build and verification results</w:t>
-            </w:r>
-          </w:p>
-        </w:tc>
-      </w:tr>
-      <w:tr>
-        <w:tc>
-          <w:tcPr>
-            <w:tcW w:type="dxa" w:w="1584"/>
-            <w:tcMar>
-              <w:top w:w="90" w:type="dxa"/>
-              <w:start w:w="110" w:type="dxa"/>
-              <w:bottom w:w="90" w:type="dxa"/>
-              <w:end w:w="110" w:type="dxa"/>
-            </w:tcMar>
-            <w:vAlign w:val="center"/>
-          </w:tcPr>
-          <w:p>
-            <w:pPr>
-              <w:spacing w:line="240" w:lineRule="auto" w:after="0"/>
-              <w:jc w:val="center"/>
-            </w:pPr>
-            <w:r>
-              <w:rPr>
-                <w:rFonts w:ascii="Times New Roman" w:hAnsi="Times New Roman"/>
-                <w:b w:val="0"/>
-                <w:i w:val="0"/>
-                <w:color w:val="000000"/>
-                <w:sz w:val="19"/>
-              </w:rPr>
-              <w:t>7.1</w:t>
-            </w:r>
-          </w:p>
-        </w:tc>
-        <w:tc>
-          <w:tcPr>
-            <w:tcW w:type="dxa" w:w="7632"/>
-            <w:tcMar>
-              <w:top w:w="90" w:type="dxa"/>
-              <w:start w:w="110" w:type="dxa"/>
-              <w:bottom w:w="90" w:type="dxa"/>
-              <w:end w:w="110" w:type="dxa"/>
-            </w:tcMar>
-            <w:vAlign w:val="center"/>
-          </w:tcPr>
-          <w:p>
-            <w:pPr>
-              <w:spacing w:line="240" w:lineRule="auto" w:after="0"/>
-              <w:jc w:val="left"/>
-            </w:pPr>
-            <w:r>
-              <w:rPr>
-                <w:rFonts w:ascii="Times New Roman" w:hAnsi="Times New Roman"/>
-                <w:b w:val="0"/>
-                <w:i w:val="0"/>
-                <w:color w:val="000000"/>
-                <w:sz w:val="19"/>
-              </w:rPr>
-              <w:t>Risk and mitigation summary</w:t>
-            </w:r>
-          </w:p>
-        </w:tc>
-      </w:tr>
-    </w:tbl>
-    <w:p>
-      <w:pPr>
-        <w:spacing w:after="40"/>
-      </w:pPr>
-    </w:p>
-    <w:p>
-      <w:r>
-        <w:br w:type="page"/>
-      </w:r>
-    </w:p>
-    <w:p>
-      <w:pPr>
-        <w:spacing w:after="240"/>
-        <w:jc w:val="center"/>
-      </w:pPr>
-      <w:r>
-        <w:rPr>
-          <w:rFonts w:ascii="Times New Roman" w:hAnsi="Times New Roman"/>
-          <w:b/>
-          <w:i w:val="0"/>
-          <w:color w:val="000000"/>
-          <w:sz w:val="32"/>
-        </w:rPr>
-        <w:t>LIST OF ABBREVIATIONS</w:t>
-      </w:r>
-    </w:p>
-    <w:tbl>
-      <w:tblPr>
-        <w:tblW w:type="auto" w:w="0"/>
-        <w:jc w:val="center"/>
-        <w:tblLayout w:type="fixed"/>
-        <w:tblLook w:firstColumn="1" w:firstRow="1" w:lastColumn="0" w:lastRow="0" w:noHBand="0" w:noVBand="1" w:val="04A0"/>
-        <w:tblBorders>
-          <w:top w:val="single" w:sz="6" w:color="D9D9D9"/>
-          <w:left w:val="single" w:sz="6" w:color="D9D9D9"/>
-          <w:bottom w:val="single" w:sz="6" w:color="D9D9D9"/>
-          <w:right w:val="single" w:sz="6" w:color="D9D9D9"/>
-          <w:insideH w:val="single" w:sz="6" w:color="D9D9D9"/>
-          <w:insideV w:val="single" w:sz="6" w:color="D9D9D9"/>
-        </w:tblBorders>
-      </w:tblPr>
-      <w:tblGrid>
-        <w:gridCol w:w="4262"/>
-        <w:gridCol w:w="4262"/>
-      </w:tblGrid>
-      <w:tr>
-        <w:trPr>
-          <w:tblHeader w:val="true"/>
-        </w:trPr>
-        <w:tc>
-          <w:tcPr>
-            <w:tcW w:type="dxa" w:w="2160"/>
-            <w:shd w:fill="1F4E78"/>
-            <w:tcMar>
-              <w:top w:w="90" w:type="dxa"/>
-              <w:start w:w="110" w:type="dxa"/>
-              <w:bottom w:w="90" w:type="dxa"/>
-              <w:end w:w="110" w:type="dxa"/>
-            </w:tcMar>
-            <w:vAlign w:val="center"/>
-          </w:tcPr>
-          <w:p>
-            <w:pPr>
-              <w:jc w:val="center"/>
-            </w:pPr>
-            <w:r>
-              <w:rPr>
-                <w:rFonts w:ascii="Times New Roman" w:hAnsi="Times New Roman"/>
-                <w:b/>
-                <w:i w:val="0"/>
-                <w:color w:val="FFFFFF"/>
-                <w:sz w:val="20"/>
-              </w:rPr>
-              <w:t>Abbreviation</w:t>
-            </w:r>
-          </w:p>
-        </w:tc>
-        <w:tc>
-          <w:tcPr>
-            <w:tcW w:type="dxa" w:w="7056"/>
-            <w:shd w:fill="1F4E78"/>
-            <w:tcMar>
-              <w:top w:w="90" w:type="dxa"/>
-              <w:start w:w="110" w:type="dxa"/>
-              <w:bottom w:w="90" w:type="dxa"/>
-              <w:end w:w="110" w:type="dxa"/>
-            </w:tcMar>
-            <w:vAlign w:val="center"/>
-          </w:tcPr>
-          <w:p>
-            <w:pPr>
-              <w:jc w:val="center"/>
-            </w:pPr>
-            <w:r>
-              <w:rPr>
-                <w:rFonts w:ascii="Times New Roman" w:hAnsi="Times New Roman"/>
-                <w:b/>
-                <w:i w:val="0"/>
-                <w:color w:val="FFFFFF"/>
-                <w:sz w:val="20"/>
-              </w:rPr>
-              <w:t>Meaning</w:t>
-            </w:r>
-          </w:p>
-        </w:tc>
-      </w:tr>
-      <w:tr>
-        <w:tc>
-          <w:tcPr>
-            <w:tcW w:type="dxa" w:w="2160"/>
-            <w:tcMar>
-              <w:top w:w="90" w:type="dxa"/>
-              <w:start w:w="110" w:type="dxa"/>
-              <w:bottom w:w="90" w:type="dxa"/>
-              <w:end w:w="110" w:type="dxa"/>
-            </w:tcMar>
-            <w:vAlign w:val="center"/>
-          </w:tcPr>
-          <w:p>
-            <w:pPr>
-              <w:spacing w:line="240" w:lineRule="auto" w:after="0"/>
-              <w:jc w:val="center"/>
-            </w:pPr>
-            <w:r>
-              <w:rPr>
-                <w:rFonts w:ascii="Times New Roman" w:hAnsi="Times New Roman"/>
-                <w:b w:val="0"/>
-                <w:i w:val="0"/>
-                <w:color w:val="000000"/>
-                <w:sz w:val="19"/>
-              </w:rPr>
-              <w:t>API</w:t>
-            </w:r>
-          </w:p>
-        </w:tc>
-        <w:tc>
-          <w:tcPr>
-            <w:tcW w:type="dxa" w:w="7056"/>
-            <w:tcMar>
-              <w:top w:w="90" w:type="dxa"/>
-              <w:start w:w="110" w:type="dxa"/>
-              <w:bottom w:w="90" w:type="dxa"/>
-              <w:end w:w="110" w:type="dxa"/>
-            </w:tcMar>
-            <w:vAlign w:val="center"/>
-          </w:tcPr>
-          <w:p>
-            <w:pPr>
-              <w:spacing w:line="240" w:lineRule="auto" w:after="0"/>
-              <w:jc w:val="left"/>
-            </w:pPr>
-            <w:r>
-              <w:rPr>
-                <w:rFonts w:ascii="Times New Roman" w:hAnsi="Times New Roman"/>
-                <w:b w:val="0"/>
-                <w:i w:val="0"/>
-                <w:color w:val="000000"/>
-                <w:sz w:val="19"/>
-              </w:rPr>
-              <w:t>Application Programming Interface</w:t>
-            </w:r>
-          </w:p>
-        </w:tc>
-      </w:tr>
-      <w:tr>
-        <w:tc>
-          <w:tcPr>
-            <w:tcW w:type="dxa" w:w="2160"/>
-            <w:tcMar>
-              <w:top w:w="90" w:type="dxa"/>
-              <w:start w:w="110" w:type="dxa"/>
-              <w:bottom w:w="90" w:type="dxa"/>
-              <w:end w:w="110" w:type="dxa"/>
-            </w:tcMar>
-            <w:vAlign w:val="center"/>
-            <w:shd w:fill="F2F6FA"/>
-          </w:tcPr>
-          <w:p>
-            <w:pPr>
-              <w:spacing w:line="240" w:lineRule="auto" w:after="0"/>
-              <w:jc w:val="center"/>
-            </w:pPr>
-            <w:r>
-              <w:rPr>
-                <w:rFonts w:ascii="Times New Roman" w:hAnsi="Times New Roman"/>
-                <w:b w:val="0"/>
-                <w:i w:val="0"/>
-                <w:color w:val="000000"/>
-                <w:sz w:val="19"/>
-              </w:rPr>
-              <w:t>CRUD</w:t>
-            </w:r>
-          </w:p>
-        </w:tc>
-        <w:tc>
-          <w:tcPr>
-            <w:tcW w:type="dxa" w:w="7056"/>
-            <w:tcMar>
-              <w:top w:w="90" w:type="dxa"/>
-              <w:start w:w="110" w:type="dxa"/>
-              <w:bottom w:w="90" w:type="dxa"/>
-              <w:end w:w="110" w:type="dxa"/>
-            </w:tcMar>
-            <w:vAlign w:val="center"/>
-            <w:shd w:fill="F2F6FA"/>
-          </w:tcPr>
-          <w:p>
-            <w:pPr>
-              <w:spacing w:line="240" w:lineRule="auto" w:after="0"/>
-              <w:jc w:val="left"/>
-            </w:pPr>
-            <w:r>
-              <w:rPr>
-                <w:rFonts w:ascii="Times New Roman" w:hAnsi="Times New Roman"/>
-                <w:b w:val="0"/>
-                <w:i w:val="0"/>
-                <w:color w:val="000000"/>
-                <w:sz w:val="19"/>
-              </w:rPr>
-              <w:t>Create Read Update Delete</w:t>
-            </w:r>
-          </w:p>
-        </w:tc>
-      </w:tr>
-      <w:tr>
-        <w:tc>
-          <w:tcPr>
-            <w:tcW w:type="dxa" w:w="2160"/>
-            <w:tcMar>
-              <w:top w:w="90" w:type="dxa"/>
-              <w:start w:w="110" w:type="dxa"/>
-              <w:bottom w:w="90" w:type="dxa"/>
-              <w:end w:w="110" w:type="dxa"/>
-            </w:tcMar>
-            <w:vAlign w:val="center"/>
-          </w:tcPr>
-          <w:p>
-            <w:pPr>
-              <w:spacing w:line="240" w:lineRule="auto" w:after="0"/>
-              <w:jc w:val="center"/>
-            </w:pPr>
-            <w:r>
-              <w:rPr>
-                <w:rFonts w:ascii="Times New Roman" w:hAnsi="Times New Roman"/>
-                <w:b w:val="0"/>
-                <w:i w:val="0"/>
-                <w:color w:val="000000"/>
-                <w:sz w:val="19"/>
-              </w:rPr>
-              <w:t>HMAC</w:t>
-            </w:r>
-          </w:p>
-        </w:tc>
-        <w:tc>
-          <w:tcPr>
-            <w:tcW w:type="dxa" w:w="7056"/>
-            <w:tcMar>
-              <w:top w:w="90" w:type="dxa"/>
-              <w:start w:w="110" w:type="dxa"/>
-              <w:bottom w:w="90" w:type="dxa"/>
-              <w:end w:w="110" w:type="dxa"/>
-            </w:tcMar>
-            <w:vAlign w:val="center"/>
-          </w:tcPr>
-          <w:p>
-            <w:pPr>
-              <w:spacing w:line="240" w:lineRule="auto" w:after="0"/>
-              <w:jc w:val="left"/>
-            </w:pPr>
-            <w:r>
-              <w:rPr>
-                <w:rFonts w:ascii="Times New Roman" w:hAnsi="Times New Roman"/>
-                <w:b w:val="0"/>
-                <w:i w:val="0"/>
-                <w:color w:val="000000"/>
-                <w:sz w:val="19"/>
-              </w:rPr>
-              <w:t>Hash based Message Authentication Code</w:t>
-            </w:r>
-          </w:p>
-        </w:tc>
-      </w:tr>
-      <w:tr>
-        <w:tc>
-          <w:tcPr>
-            <w:tcW w:type="dxa" w:w="2160"/>
-            <w:tcMar>
-              <w:top w:w="90" w:type="dxa"/>
-              <w:start w:w="110" w:type="dxa"/>
-              <w:bottom w:w="90" w:type="dxa"/>
-              <w:end w:w="110" w:type="dxa"/>
-            </w:tcMar>
-            <w:vAlign w:val="center"/>
-            <w:shd w:fill="F2F6FA"/>
-          </w:tcPr>
-          <w:p>
-            <w:pPr>
-              <w:spacing w:line="240" w:lineRule="auto" w:after="0"/>
-              <w:jc w:val="center"/>
-            </w:pPr>
-            <w:r>
-              <w:rPr>
-                <w:rFonts w:ascii="Times New Roman" w:hAnsi="Times New Roman"/>
-                <w:b w:val="0"/>
-                <w:i w:val="0"/>
-                <w:color w:val="000000"/>
-                <w:sz w:val="19"/>
-              </w:rPr>
-              <w:t>HTTP</w:t>
-            </w:r>
-          </w:p>
-        </w:tc>
-        <w:tc>
-          <w:tcPr>
-            <w:tcW w:type="dxa" w:w="7056"/>
-            <w:tcMar>
-              <w:top w:w="90" w:type="dxa"/>
-              <w:start w:w="110" w:type="dxa"/>
-              <w:bottom w:w="90" w:type="dxa"/>
-              <w:end w:w="110" w:type="dxa"/>
-            </w:tcMar>
-            <w:vAlign w:val="center"/>
-            <w:shd w:fill="F2F6FA"/>
-          </w:tcPr>
-          <w:p>
-            <w:pPr>
-              <w:spacing w:line="240" w:lineRule="auto" w:after="0"/>
-              <w:jc w:val="left"/>
-            </w:pPr>
-            <w:r>
-              <w:rPr>
-                <w:rFonts w:ascii="Times New Roman" w:hAnsi="Times New Roman"/>
-                <w:b w:val="0"/>
-                <w:i w:val="0"/>
-                <w:color w:val="000000"/>
-                <w:sz w:val="19"/>
-              </w:rPr>
-              <w:t>Hypertext Transfer Protocol</w:t>
-            </w:r>
-          </w:p>
-        </w:tc>
-      </w:tr>
-      <w:tr>
-        <w:tc>
-          <w:tcPr>
-            <w:tcW w:type="dxa" w:w="2160"/>
-            <w:tcMar>
-              <w:top w:w="90" w:type="dxa"/>
-              <w:start w:w="110" w:type="dxa"/>
-              <w:bottom w:w="90" w:type="dxa"/>
-              <w:end w:w="110" w:type="dxa"/>
-            </w:tcMar>
-            <w:vAlign w:val="center"/>
-          </w:tcPr>
-          <w:p>
-            <w:pPr>
-              <w:spacing w:line="240" w:lineRule="auto" w:after="0"/>
-              <w:jc w:val="center"/>
-            </w:pPr>
-            <w:r>
-              <w:rPr>
-                <w:rFonts w:ascii="Times New Roman" w:hAnsi="Times New Roman"/>
-                <w:b w:val="0"/>
-                <w:i w:val="0"/>
-                <w:color w:val="000000"/>
-                <w:sz w:val="19"/>
-              </w:rPr>
-              <w:t>INR</w:t>
-            </w:r>
-          </w:p>
-        </w:tc>
-        <w:tc>
-          <w:tcPr>
-            <w:tcW w:type="dxa" w:w="7056"/>
-            <w:tcMar>
-              <w:top w:w="90" w:type="dxa"/>
-              <w:start w:w="110" w:type="dxa"/>
-              <w:bottom w:w="90" w:type="dxa"/>
-              <w:end w:w="110" w:type="dxa"/>
-            </w:tcMar>
-            <w:vAlign w:val="center"/>
-          </w:tcPr>
-          <w:p>
-            <w:pPr>
-              <w:spacing w:line="240" w:lineRule="auto" w:after="0"/>
-              <w:jc w:val="center"/>
-            </w:pPr>
-            <w:r>
-              <w:rPr>
-                <w:rFonts w:ascii="Times New Roman" w:hAnsi="Times New Roman"/>
-                <w:b w:val="0"/>
-                <w:i w:val="0"/>
-                <w:color w:val="000000"/>
-                <w:sz w:val="19"/>
-              </w:rPr>
-              <w:t>Indian Rupee</w:t>
-            </w:r>
-          </w:p>
-        </w:tc>
-      </w:tr>
-      <w:tr>
-        <w:tc>
-          <w:tcPr>
-            <w:tcW w:type="dxa" w:w="2160"/>
-            <w:tcMar>
-              <w:top w:w="90" w:type="dxa"/>
-              <w:start w:w="110" w:type="dxa"/>
-              <w:bottom w:w="90" w:type="dxa"/>
-              <w:end w:w="110" w:type="dxa"/>
-            </w:tcMar>
-            <w:vAlign w:val="center"/>
-            <w:shd w:fill="F2F6FA"/>
-          </w:tcPr>
-          <w:p>
-            <w:pPr>
-              <w:spacing w:line="240" w:lineRule="auto" w:after="0"/>
-              <w:jc w:val="center"/>
-            </w:pPr>
-            <w:r>
-              <w:rPr>
-                <w:rFonts w:ascii="Times New Roman" w:hAnsi="Times New Roman"/>
-                <w:b w:val="0"/>
-                <w:i w:val="0"/>
-                <w:color w:val="000000"/>
-                <w:sz w:val="19"/>
-              </w:rPr>
-              <w:t>JSON</w:t>
-            </w:r>
-          </w:p>
-        </w:tc>
-        <w:tc>
-          <w:tcPr>
-            <w:tcW w:type="dxa" w:w="7056"/>
-            <w:tcMar>
-              <w:top w:w="90" w:type="dxa"/>
-              <w:start w:w="110" w:type="dxa"/>
-              <w:bottom w:w="90" w:type="dxa"/>
-              <w:end w:w="110" w:type="dxa"/>
-            </w:tcMar>
-            <w:vAlign w:val="center"/>
-            <w:shd w:fill="F2F6FA"/>
-          </w:tcPr>
-          <w:p>
-            <w:pPr>
-              <w:spacing w:line="240" w:lineRule="auto" w:after="0"/>
-              <w:jc w:val="left"/>
-            </w:pPr>
-            <w:r>
-              <w:rPr>
-                <w:rFonts w:ascii="Times New Roman" w:hAnsi="Times New Roman"/>
-                <w:b w:val="0"/>
-                <w:i w:val="0"/>
-                <w:color w:val="000000"/>
-                <w:sz w:val="19"/>
-              </w:rPr>
-              <w:t>JavaScript Object Notation</w:t>
-            </w:r>
-          </w:p>
-        </w:tc>
-      </w:tr>
-      <w:tr>
-        <w:tc>
-          <w:tcPr>
-            <w:tcW w:type="dxa" w:w="2160"/>
-            <w:tcMar>
-              <w:top w:w="90" w:type="dxa"/>
-              <w:start w:w="110" w:type="dxa"/>
-              <w:bottom w:w="90" w:type="dxa"/>
-              <w:end w:w="110" w:type="dxa"/>
-            </w:tcMar>
-            <w:vAlign w:val="center"/>
-          </w:tcPr>
-          <w:p>
-            <w:pPr>
-              <w:spacing w:line="240" w:lineRule="auto" w:after="0"/>
-              <w:jc w:val="center"/>
-            </w:pPr>
-            <w:r>
-              <w:rPr>
-                <w:rFonts w:ascii="Times New Roman" w:hAnsi="Times New Roman"/>
-                <w:b w:val="0"/>
-                <w:i w:val="0"/>
-                <w:color w:val="000000"/>
-                <w:sz w:val="19"/>
-              </w:rPr>
-              <w:t>JWT</w:t>
-            </w:r>
-          </w:p>
-        </w:tc>
-        <w:tc>
-          <w:tcPr>
-            <w:tcW w:type="dxa" w:w="7056"/>
-            <w:tcMar>
-              <w:top w:w="90" w:type="dxa"/>
-              <w:start w:w="110" w:type="dxa"/>
-              <w:bottom w:w="90" w:type="dxa"/>
-              <w:end w:w="110" w:type="dxa"/>
-            </w:tcMar>
-            <w:vAlign w:val="center"/>
-          </w:tcPr>
-          <w:p>
-            <w:pPr>
-              <w:spacing w:line="240" w:lineRule="auto" w:after="0"/>
-              <w:jc w:val="center"/>
-            </w:pPr>
-            <w:r>
-              <w:rPr>
-                <w:rFonts w:ascii="Times New Roman" w:hAnsi="Times New Roman"/>
-                <w:b w:val="0"/>
-                <w:i w:val="0"/>
-                <w:color w:val="000000"/>
-                <w:sz w:val="19"/>
-              </w:rPr>
-              <w:t>JSON Web Token</w:t>
-            </w:r>
-          </w:p>
-        </w:tc>
-      </w:tr>
-      <w:tr>
-        <w:tc>
-          <w:tcPr>
-            <w:tcW w:type="dxa" w:w="2160"/>
-            <w:tcMar>
-              <w:top w:w="90" w:type="dxa"/>
-              <w:start w:w="110" w:type="dxa"/>
-              <w:bottom w:w="90" w:type="dxa"/>
-              <w:end w:w="110" w:type="dxa"/>
-            </w:tcMar>
-            <w:vAlign w:val="center"/>
-            <w:shd w:fill="F2F6FA"/>
-          </w:tcPr>
-          <w:p>
-            <w:pPr>
-              <w:spacing w:line="240" w:lineRule="auto" w:after="0"/>
-              <w:jc w:val="center"/>
-            </w:pPr>
-            <w:r>
-              <w:rPr>
-                <w:rFonts w:ascii="Times New Roman" w:hAnsi="Times New Roman"/>
-                <w:b w:val="0"/>
-                <w:i w:val="0"/>
-                <w:color w:val="000000"/>
-                <w:sz w:val="19"/>
-              </w:rPr>
-              <w:t>NoSQL</w:t>
-            </w:r>
-          </w:p>
-        </w:tc>
-        <w:tc>
-          <w:tcPr>
-            <w:tcW w:type="dxa" w:w="7056"/>
-            <w:tcMar>
-              <w:top w:w="90" w:type="dxa"/>
-              <w:start w:w="110" w:type="dxa"/>
-              <w:bottom w:w="90" w:type="dxa"/>
-              <w:end w:w="110" w:type="dxa"/>
-            </w:tcMar>
-            <w:vAlign w:val="center"/>
-            <w:shd w:fill="F2F6FA"/>
-          </w:tcPr>
-          <w:p>
-            <w:pPr>
-              <w:spacing w:line="240" w:lineRule="auto" w:after="0"/>
-              <w:jc w:val="left"/>
-            </w:pPr>
-            <w:r>
-              <w:rPr>
-                <w:rFonts w:ascii="Times New Roman" w:hAnsi="Times New Roman"/>
-                <w:b w:val="0"/>
-                <w:i w:val="0"/>
-                <w:color w:val="000000"/>
-                <w:sz w:val="19"/>
-              </w:rPr>
-              <w:t>Non relational database model</w:t>
-            </w:r>
-          </w:p>
-        </w:tc>
-      </w:tr>
-      <w:tr>
-        <w:tc>
-          <w:tcPr>
-            <w:tcW w:type="dxa" w:w="2160"/>
-            <w:tcMar>
-              <w:top w:w="90" w:type="dxa"/>
-              <w:start w:w="110" w:type="dxa"/>
-              <w:bottom w:w="90" w:type="dxa"/>
-              <w:end w:w="110" w:type="dxa"/>
-            </w:tcMar>
-            <w:vAlign w:val="center"/>
-          </w:tcPr>
-          <w:p>
-            <w:pPr>
-              <w:spacing w:line="240" w:lineRule="auto" w:after="0"/>
-              <w:jc w:val="center"/>
-            </w:pPr>
-            <w:r>
-              <w:rPr>
-                <w:rFonts w:ascii="Times New Roman" w:hAnsi="Times New Roman"/>
-                <w:b w:val="0"/>
-                <w:i w:val="0"/>
-                <w:color w:val="000000"/>
-                <w:sz w:val="19"/>
-              </w:rPr>
-              <w:t>SPA</w:t>
-            </w:r>
-          </w:p>
-        </w:tc>
-        <w:tc>
-          <w:tcPr>
-            <w:tcW w:type="dxa" w:w="7056"/>
-            <w:tcMar>
-              <w:top w:w="90" w:type="dxa"/>
-              <w:start w:w="110" w:type="dxa"/>
-              <w:bottom w:w="90" w:type="dxa"/>
-              <w:end w:w="110" w:type="dxa"/>
-            </w:tcMar>
-            <w:vAlign w:val="center"/>
-          </w:tcPr>
-          <w:p>
-            <w:pPr>
-              <w:spacing w:line="240" w:lineRule="auto" w:after="0"/>
-              <w:jc w:val="center"/>
-            </w:pPr>
-            <w:r>
-              <w:rPr>
-                <w:rFonts w:ascii="Times New Roman" w:hAnsi="Times New Roman"/>
-                <w:b w:val="0"/>
-                <w:i w:val="0"/>
-                <w:color w:val="000000"/>
-                <w:sz w:val="19"/>
-              </w:rPr>
-              <w:t>Single Page Application</w:t>
-            </w:r>
-          </w:p>
-        </w:tc>
-      </w:tr>
-      <w:tr>
-        <w:tc>
-          <w:tcPr>
-            <w:tcW w:type="dxa" w:w="2160"/>
-            <w:tcMar>
-              <w:top w:w="90" w:type="dxa"/>
-              <w:start w:w="110" w:type="dxa"/>
-              <w:bottom w:w="90" w:type="dxa"/>
-              <w:end w:w="110" w:type="dxa"/>
-            </w:tcMar>
-            <w:vAlign w:val="center"/>
-            <w:shd w:fill="F2F6FA"/>
-          </w:tcPr>
-          <w:p>
-            <w:pPr>
-              <w:spacing w:line="240" w:lineRule="auto" w:after="0"/>
-              <w:jc w:val="center"/>
-            </w:pPr>
-            <w:r>
-              <w:rPr>
-                <w:rFonts w:ascii="Times New Roman" w:hAnsi="Times New Roman"/>
-                <w:b w:val="0"/>
-                <w:i w:val="0"/>
-                <w:color w:val="000000"/>
-                <w:sz w:val="19"/>
-              </w:rPr>
-              <w:t>UI</w:t>
-            </w:r>
-          </w:p>
-        </w:tc>
-        <w:tc>
-          <w:tcPr>
-            <w:tcW w:type="dxa" w:w="7056"/>
-            <w:tcMar>
-              <w:top w:w="90" w:type="dxa"/>
-              <w:start w:w="110" w:type="dxa"/>
-              <w:bottom w:w="90" w:type="dxa"/>
-              <w:end w:w="110" w:type="dxa"/>
-            </w:tcMar>
-            <w:vAlign w:val="center"/>
-            <w:shd w:fill="F2F6FA"/>
-          </w:tcPr>
-          <w:p>
-            <w:pPr>
-              <w:spacing w:line="240" w:lineRule="auto" w:after="0"/>
-              <w:jc w:val="center"/>
-            </w:pPr>
-            <w:r>
-              <w:rPr>
-                <w:rFonts w:ascii="Times New Roman" w:hAnsi="Times New Roman"/>
-                <w:b w:val="0"/>
-                <w:i w:val="0"/>
-                <w:color w:val="000000"/>
-                <w:sz w:val="19"/>
-              </w:rPr>
-              <w:t>User Interface</w:t>
-            </w:r>
-          </w:p>
-        </w:tc>
-      </w:tr>
-      <w:tr>
-        <w:tc>
-          <w:tcPr>
-            <w:tcW w:type="dxa" w:w="2160"/>
-            <w:tcMar>
-              <w:top w:w="90" w:type="dxa"/>
-              <w:start w:w="110" w:type="dxa"/>
-              <w:bottom w:w="90" w:type="dxa"/>
-              <w:end w:w="110" w:type="dxa"/>
-            </w:tcMar>
-            <w:vAlign w:val="center"/>
-          </w:tcPr>
-          <w:p>
-            <w:pPr>
-              <w:spacing w:line="240" w:lineRule="auto" w:after="0"/>
-              <w:jc w:val="center"/>
-            </w:pPr>
-            <w:r>
-              <w:rPr>
-                <w:rFonts w:ascii="Times New Roman" w:hAnsi="Times New Roman"/>
-                <w:b w:val="0"/>
-                <w:i w:val="0"/>
-                <w:color w:val="000000"/>
-                <w:sz w:val="19"/>
-              </w:rPr>
-              <w:t>UPI</w:t>
-            </w:r>
-          </w:p>
-        </w:tc>
-        <w:tc>
-          <w:tcPr>
-            <w:tcW w:type="dxa" w:w="7056"/>
-            <w:tcMar>
-              <w:top w:w="90" w:type="dxa"/>
-              <w:start w:w="110" w:type="dxa"/>
-              <w:bottom w:w="90" w:type="dxa"/>
-              <w:end w:w="110" w:type="dxa"/>
-            </w:tcMar>
-            <w:vAlign w:val="center"/>
-          </w:tcPr>
-          <w:p>
-            <w:pPr>
-              <w:spacing w:line="240" w:lineRule="auto" w:after="0"/>
-              <w:jc w:val="left"/>
-            </w:pPr>
-            <w:r>
-              <w:rPr>
-                <w:rFonts w:ascii="Times New Roman" w:hAnsi="Times New Roman"/>
-                <w:b w:val="0"/>
-                <w:i w:val="0"/>
-                <w:color w:val="000000"/>
-                <w:sz w:val="19"/>
-              </w:rPr>
-              <w:t>Unified Payments Interface</w:t>
-            </w:r>
-          </w:p>
-        </w:tc>
-      </w:tr>
-      <w:tr>
-        <w:tc>
-          <w:tcPr>
-            <w:tcW w:type="dxa" w:w="2160"/>
-            <w:tcMar>
-              <w:top w:w="90" w:type="dxa"/>
-              <w:start w:w="110" w:type="dxa"/>
-              <w:bottom w:w="90" w:type="dxa"/>
-              <w:end w:w="110" w:type="dxa"/>
-            </w:tcMar>
-            <w:vAlign w:val="center"/>
-            <w:shd w:fill="F2F6FA"/>
-          </w:tcPr>
-          <w:p>
-            <w:pPr>
-              <w:spacing w:line="240" w:lineRule="auto" w:after="0"/>
-              <w:jc w:val="center"/>
-            </w:pPr>
-            <w:r>
-              <w:rPr>
-                <w:rFonts w:ascii="Times New Roman" w:hAnsi="Times New Roman"/>
-                <w:b w:val="0"/>
-                <w:i w:val="0"/>
-                <w:color w:val="000000"/>
-                <w:sz w:val="19"/>
-              </w:rPr>
-              <w:t>UX</w:t>
-            </w:r>
-          </w:p>
-        </w:tc>
-        <w:tc>
-          <w:tcPr>
-            <w:tcW w:type="dxa" w:w="7056"/>
-            <w:tcMar>
-              <w:top w:w="90" w:type="dxa"/>
-              <w:start w:w="110" w:type="dxa"/>
-              <w:bottom w:w="90" w:type="dxa"/>
-              <w:end w:w="110" w:type="dxa"/>
-            </w:tcMar>
-            <w:vAlign w:val="center"/>
-            <w:shd w:fill="F2F6FA"/>
-          </w:tcPr>
-          <w:p>
-            <w:pPr>
-              <w:spacing w:line="240" w:lineRule="auto" w:after="0"/>
-              <w:jc w:val="center"/>
-            </w:pPr>
-            <w:r>
-              <w:rPr>
-                <w:rFonts w:ascii="Times New Roman" w:hAnsi="Times New Roman"/>
-                <w:b w:val="0"/>
-                <w:i w:val="0"/>
-                <w:color w:val="000000"/>
-                <w:sz w:val="19"/>
-              </w:rPr>
-              <w:t>User Experience</w:t>
-            </w:r>
-          </w:p>
-        </w:tc>
-      </w:tr>
-    </w:tbl>
-    <w:p>
-      <w:pPr>
-        <w:spacing w:after="40"/>
-      </w:pPr>
     </w:p>
     <w:p>
       <w:pPr>

</xml_diff>